<commit_message>
Update documentation, adjust glossary extraction, and cleanup repository
</commit_message>
<xml_diff>
--- a/output/DigComp3_glossary_nl.docx
+++ b/output/DigComp3_glossary_nl.docx
@@ -2,21 +2,6 @@
 <file path=word/document.xml><?xml version="1.0" encoding="utf-8"?>
 <w:document xmlns:wpc="http://schemas.microsoft.com/office/word/2010/wordprocessingCanvas" xmlns:mo="http://schemas.microsoft.com/office/mac/office/2008/main" xmlns:mc="http://schemas.openxmlformats.org/markup-compatibility/2006" xmlns:mv="urn:schemas-microsoft-com:mac:vml" xmlns:o="urn:schemas-microsoft-com:office:office" xmlns:r="http://schemas.openxmlformats.org/officeDocument/2006/relationships" xmlns:m="http://schemas.openxmlformats.org/officeDocument/2006/math" xmlns:v="urn:schemas-microsoft-com:vml" xmlns:wp14="http://schemas.microsoft.com/office/word/2010/wordprocessingDrawing" xmlns:wp="http://schemas.openxmlformats.org/drawingml/2006/wordprocessingDrawing" xmlns:w10="urn:schemas-microsoft-com:office:word" xmlns:w="http://schemas.openxmlformats.org/wordprocessingml/2006/main" xmlns:w14="http://schemas.microsoft.com/office/word/2010/wordml" xmlns:wpg="http://schemas.microsoft.com/office/word/2010/wordprocessingGroup" xmlns:wpi="http://schemas.microsoft.com/office/word/2010/wordprocessingInk" xmlns:wne="http://schemas.microsoft.com/office/word/2006/wordml" xmlns:wps="http://schemas.microsoft.com/office/word/2010/wordprocessingShape" mc:Ignorable="w14 wp14">
   <w:body>
-    <w:p>
-      <w:pPr>
-        <w:pStyle w:val="Heading1"/>
-      </w:pPr>
-      <w:r>
-        <w:rPr>
-          <w:rFonts w:ascii="Arial" w:hAnsi="Arial"/>
-          <w:b w:val="0"/>
-          <w:i w:val="0"/>
-          <w:color w:val="1F4E78"/>
-          <w:sz w:val="36"/>
-        </w:rPr>
-        <w:t>GLOSSARIUM VAN TERMEN EN DEFINITIES</w:t>
-      </w:r>
-    </w:p>
     <w:tbl>
       <w:tblPr>
         <w:tblW w:type="auto" w:w="0"/>
@@ -32,14 +17,13 @@
         </w:tblBorders>
       </w:tblPr>
       <w:tblGrid>
-        <w:gridCol w:w="2880"/>
-        <w:gridCol w:w="2880"/>
-        <w:gridCol w:w="2880"/>
+        <w:gridCol w:w="4320"/>
+        <w:gridCol w:w="4320"/>
       </w:tblGrid>
       <w:tr>
         <w:tc>
           <w:tcPr>
-            <w:tcW w:type="dxa" w:w="2880"/>
+            <w:tcW w:type="dxa" w:w="4320"/>
             <w:shd w:fill="1F4E78"/>
           </w:tcPr>
           <w:p>
@@ -57,7 +41,7 @@
         </w:tc>
         <w:tc>
           <w:tcPr>
-            <w:tcW w:type="dxa" w:w="2880"/>
+            <w:tcW w:type="dxa" w:w="4320"/>
             <w:shd w:fill="1F4E78"/>
           </w:tcPr>
           <w:p>
@@ -73,29 +57,11 @@
             </w:r>
           </w:p>
         </w:tc>
-        <w:tc>
-          <w:tcPr>
-            <w:tcW w:type="dxa" w:w="2880"/>
-            <w:shd w:fill="1F4E78"/>
-          </w:tcPr>
-          <w:p>
-            <w:r>
-              <w:rPr>
-                <w:rFonts w:ascii="Arial" w:hAnsi="Arial"/>
-                <w:b/>
-                <w:i w:val="0"/>
-                <w:color w:val="FFFFFF"/>
-                <w:sz w:val="18"/>
-              </w:rPr>
-              <w:t>BRON</w:t>
-            </w:r>
-          </w:p>
-        </w:tc>
       </w:tr>
       <w:tr>
         <w:tc>
           <w:tcPr>
-            <w:tcW w:type="dxa" w:w="2880"/>
+            <w:tcW w:type="dxa" w:w="4320"/>
           </w:tcPr>
           <w:p>
             <w:r>
@@ -112,7 +78,7 @@
         </w:tc>
         <w:tc>
           <w:tcPr>
-            <w:tcW w:type="dxa" w:w="2880"/>
+            <w:tcW w:type="dxa" w:w="4320"/>
           </w:tcPr>
           <w:p>
             <w:r>
@@ -127,27 +93,11 @@
             </w:r>
           </w:p>
         </w:tc>
-        <w:tc>
-          <w:tcPr>
-            <w:tcW w:type="dxa" w:w="2880"/>
-          </w:tcPr>
-          <w:p>
-            <w:r>
-              <w:rPr>
-                <w:rFonts w:ascii="Arial" w:hAnsi="Arial"/>
-                <w:b w:val="0"/>
-                <w:i w:val="0"/>
-                <w:color w:val="000000"/>
-                <w:sz w:val="18"/>
-              </w:rPr>
-            </w:r>
-          </w:p>
-        </w:tc>
       </w:tr>
       <w:tr>
         <w:tc>
           <w:tcPr>
-            <w:tcW w:type="dxa" w:w="2880"/>
+            <w:tcW w:type="dxa" w:w="4320"/>
           </w:tcPr>
           <w:p>
             <w:r>
@@ -164,7 +114,7 @@
         </w:tc>
         <w:tc>
           <w:tcPr>
-            <w:tcW w:type="dxa" w:w="2880"/>
+            <w:tcW w:type="dxa" w:w="4320"/>
           </w:tcPr>
           <w:p>
             <w:r>
@@ -179,27 +129,11 @@
             </w:r>
           </w:p>
         </w:tc>
-        <w:tc>
-          <w:tcPr>
-            <w:tcW w:type="dxa" w:w="2880"/>
-          </w:tcPr>
-          <w:p>
-            <w:r>
-              <w:rPr>
-                <w:rFonts w:ascii="Arial" w:hAnsi="Arial"/>
-                <w:b w:val="0"/>
-                <w:i w:val="0"/>
-                <w:color w:val="000000"/>
-                <w:sz w:val="18"/>
-              </w:rPr>
-            </w:r>
-          </w:p>
-        </w:tc>
       </w:tr>
       <w:tr>
         <w:tc>
           <w:tcPr>
-            <w:tcW w:type="dxa" w:w="2880"/>
+            <w:tcW w:type="dxa" w:w="4320"/>
           </w:tcPr>
           <w:p>
             <w:r>
@@ -216,7 +150,7 @@
         </w:tc>
         <w:tc>
           <w:tcPr>
-            <w:tcW w:type="dxa" w:w="2880"/>
+            <w:tcW w:type="dxa" w:w="4320"/>
           </w:tcPr>
           <w:p>
             <w:r>
@@ -231,27 +165,11 @@
             </w:r>
           </w:p>
         </w:tc>
-        <w:tc>
-          <w:tcPr>
-            <w:tcW w:type="dxa" w:w="2880"/>
-          </w:tcPr>
-          <w:p>
-            <w:r>
-              <w:rPr>
-                <w:rFonts w:ascii="Arial" w:hAnsi="Arial"/>
-                <w:b w:val="0"/>
-                <w:i w:val="0"/>
-                <w:color w:val="000000"/>
-                <w:sz w:val="18"/>
-              </w:rPr>
-            </w:r>
-          </w:p>
-        </w:tc>
       </w:tr>
       <w:tr>
         <w:tc>
           <w:tcPr>
-            <w:tcW w:type="dxa" w:w="2880"/>
+            <w:tcW w:type="dxa" w:w="4320"/>
           </w:tcPr>
           <w:p>
             <w:r>
@@ -268,7 +186,7 @@
         </w:tc>
         <w:tc>
           <w:tcPr>
-            <w:tcW w:type="dxa" w:w="2880"/>
+            <w:tcW w:type="dxa" w:w="4320"/>
           </w:tcPr>
           <w:p>
             <w:r>
@@ -283,27 +201,11 @@
             </w:r>
           </w:p>
         </w:tc>
-        <w:tc>
-          <w:tcPr>
-            <w:tcW w:type="dxa" w:w="2880"/>
-          </w:tcPr>
-          <w:p>
-            <w:r>
-              <w:rPr>
-                <w:rFonts w:ascii="Arial" w:hAnsi="Arial"/>
-                <w:b w:val="0"/>
-                <w:i w:val="0"/>
-                <w:color w:val="000000"/>
-                <w:sz w:val="18"/>
-              </w:rPr>
-            </w:r>
-          </w:p>
-        </w:tc>
       </w:tr>
       <w:tr>
         <w:tc>
           <w:tcPr>
-            <w:tcW w:type="dxa" w:w="2880"/>
+            <w:tcW w:type="dxa" w:w="4320"/>
           </w:tcPr>
           <w:p>
             <w:r>
@@ -320,7 +222,7 @@
         </w:tc>
         <w:tc>
           <w:tcPr>
-            <w:tcW w:type="dxa" w:w="2880"/>
+            <w:tcW w:type="dxa" w:w="4320"/>
           </w:tcPr>
           <w:p>
             <w:r>
@@ -335,27 +237,11 @@
             </w:r>
           </w:p>
         </w:tc>
-        <w:tc>
-          <w:tcPr>
-            <w:tcW w:type="dxa" w:w="2880"/>
-          </w:tcPr>
-          <w:p>
-            <w:r>
-              <w:rPr>
-                <w:rFonts w:ascii="Arial" w:hAnsi="Arial"/>
-                <w:b w:val="0"/>
-                <w:i w:val="0"/>
-                <w:color w:val="000000"/>
-                <w:sz w:val="18"/>
-              </w:rPr>
-            </w:r>
-          </w:p>
-        </w:tc>
       </w:tr>
       <w:tr>
         <w:tc>
           <w:tcPr>
-            <w:tcW w:type="dxa" w:w="2880"/>
+            <w:tcW w:type="dxa" w:w="4320"/>
           </w:tcPr>
           <w:p>
             <w:r>
@@ -372,7 +258,7 @@
         </w:tc>
         <w:tc>
           <w:tcPr>
-            <w:tcW w:type="dxa" w:w="2880"/>
+            <w:tcW w:type="dxa" w:w="4320"/>
           </w:tcPr>
           <w:p>
             <w:r>
@@ -387,27 +273,11 @@
             </w:r>
           </w:p>
         </w:tc>
-        <w:tc>
-          <w:tcPr>
-            <w:tcW w:type="dxa" w:w="2880"/>
-          </w:tcPr>
-          <w:p>
-            <w:r>
-              <w:rPr>
-                <w:rFonts w:ascii="Arial" w:hAnsi="Arial"/>
-                <w:b w:val="0"/>
-                <w:i w:val="0"/>
-                <w:color w:val="000000"/>
-                <w:sz w:val="18"/>
-              </w:rPr>
-            </w:r>
-          </w:p>
-        </w:tc>
       </w:tr>
       <w:tr>
         <w:tc>
           <w:tcPr>
-            <w:tcW w:type="dxa" w:w="2880"/>
+            <w:tcW w:type="dxa" w:w="4320"/>
           </w:tcPr>
           <w:p>
             <w:r>
@@ -424,7 +294,7 @@
         </w:tc>
         <w:tc>
           <w:tcPr>
-            <w:tcW w:type="dxa" w:w="2880"/>
+            <w:tcW w:type="dxa" w:w="4320"/>
           </w:tcPr>
           <w:p>
             <w:r>
@@ -439,27 +309,11 @@
             </w:r>
           </w:p>
         </w:tc>
-        <w:tc>
-          <w:tcPr>
-            <w:tcW w:type="dxa" w:w="2880"/>
-          </w:tcPr>
-          <w:p>
-            <w:r>
-              <w:rPr>
-                <w:rFonts w:ascii="Arial" w:hAnsi="Arial"/>
-                <w:b w:val="0"/>
-                <w:i w:val="0"/>
-                <w:color w:val="000000"/>
-                <w:sz w:val="18"/>
-              </w:rPr>
-            </w:r>
-          </w:p>
-        </w:tc>
       </w:tr>
       <w:tr>
         <w:tc>
           <w:tcPr>
-            <w:tcW w:type="dxa" w:w="2880"/>
+            <w:tcW w:type="dxa" w:w="4320"/>
           </w:tcPr>
           <w:p>
             <w:r>
@@ -476,7 +330,7 @@
         </w:tc>
         <w:tc>
           <w:tcPr>
-            <w:tcW w:type="dxa" w:w="2880"/>
+            <w:tcW w:type="dxa" w:w="4320"/>
           </w:tcPr>
           <w:p>
             <w:r>
@@ -491,27 +345,11 @@
             </w:r>
           </w:p>
         </w:tc>
-        <w:tc>
-          <w:tcPr>
-            <w:tcW w:type="dxa" w:w="2880"/>
-          </w:tcPr>
-          <w:p>
-            <w:r>
-              <w:rPr>
-                <w:rFonts w:ascii="Arial" w:hAnsi="Arial"/>
-                <w:b w:val="0"/>
-                <w:i w:val="0"/>
-                <w:color w:val="000000"/>
-                <w:sz w:val="18"/>
-              </w:rPr>
-            </w:r>
-          </w:p>
-        </w:tc>
       </w:tr>
       <w:tr>
         <w:tc>
           <w:tcPr>
-            <w:tcW w:type="dxa" w:w="2880"/>
+            <w:tcW w:type="dxa" w:w="4320"/>
           </w:tcPr>
           <w:p>
             <w:r>
@@ -528,7 +366,7 @@
         </w:tc>
         <w:tc>
           <w:tcPr>
-            <w:tcW w:type="dxa" w:w="2880"/>
+            <w:tcW w:type="dxa" w:w="4320"/>
           </w:tcPr>
           <w:p>
             <w:r>
@@ -543,27 +381,11 @@
             </w:r>
           </w:p>
         </w:tc>
-        <w:tc>
-          <w:tcPr>
-            <w:tcW w:type="dxa" w:w="2880"/>
-          </w:tcPr>
-          <w:p>
-            <w:r>
-              <w:rPr>
-                <w:rFonts w:ascii="Arial" w:hAnsi="Arial"/>
-                <w:b w:val="0"/>
-                <w:i w:val="0"/>
-                <w:color w:val="000000"/>
-                <w:sz w:val="18"/>
-              </w:rPr>
-            </w:r>
-          </w:p>
-        </w:tc>
       </w:tr>
       <w:tr>
         <w:tc>
           <w:tcPr>
-            <w:tcW w:type="dxa" w:w="2880"/>
+            <w:tcW w:type="dxa" w:w="4320"/>
           </w:tcPr>
           <w:p>
             <w:r>
@@ -580,7 +402,7 @@
         </w:tc>
         <w:tc>
           <w:tcPr>
-            <w:tcW w:type="dxa" w:w="2880"/>
+            <w:tcW w:type="dxa" w:w="4320"/>
           </w:tcPr>
           <w:p>
             <w:r>
@@ -595,27 +417,11 @@
             </w:r>
           </w:p>
         </w:tc>
-        <w:tc>
-          <w:tcPr>
-            <w:tcW w:type="dxa" w:w="2880"/>
-          </w:tcPr>
-          <w:p>
-            <w:r>
-              <w:rPr>
-                <w:rFonts w:ascii="Arial" w:hAnsi="Arial"/>
-                <w:b w:val="0"/>
-                <w:i w:val="0"/>
-                <w:color w:val="000000"/>
-                <w:sz w:val="18"/>
-              </w:rPr>
-            </w:r>
-          </w:p>
-        </w:tc>
       </w:tr>
       <w:tr>
         <w:tc>
           <w:tcPr>
-            <w:tcW w:type="dxa" w:w="2880"/>
+            <w:tcW w:type="dxa" w:w="4320"/>
           </w:tcPr>
           <w:p>
             <w:r>
@@ -632,7 +438,7 @@
         </w:tc>
         <w:tc>
           <w:tcPr>
-            <w:tcW w:type="dxa" w:w="2880"/>
+            <w:tcW w:type="dxa" w:w="4320"/>
           </w:tcPr>
           <w:p>
             <w:r>
@@ -647,27 +453,11 @@
             </w:r>
           </w:p>
         </w:tc>
-        <w:tc>
-          <w:tcPr>
-            <w:tcW w:type="dxa" w:w="2880"/>
-          </w:tcPr>
-          <w:p>
-            <w:r>
-              <w:rPr>
-                <w:rFonts w:ascii="Arial" w:hAnsi="Arial"/>
-                <w:b w:val="0"/>
-                <w:i w:val="0"/>
-                <w:color w:val="000000"/>
-                <w:sz w:val="18"/>
-              </w:rPr>
-            </w:r>
-          </w:p>
-        </w:tc>
       </w:tr>
       <w:tr>
         <w:tc>
           <w:tcPr>
-            <w:tcW w:type="dxa" w:w="2880"/>
+            <w:tcW w:type="dxa" w:w="4320"/>
           </w:tcPr>
           <w:p>
             <w:r>
@@ -684,7 +474,7 @@
         </w:tc>
         <w:tc>
           <w:tcPr>
-            <w:tcW w:type="dxa" w:w="2880"/>
+            <w:tcW w:type="dxa" w:w="4320"/>
           </w:tcPr>
           <w:p>
             <w:r>
@@ -699,27 +489,11 @@
             </w:r>
           </w:p>
         </w:tc>
-        <w:tc>
-          <w:tcPr>
-            <w:tcW w:type="dxa" w:w="2880"/>
-          </w:tcPr>
-          <w:p>
-            <w:r>
-              <w:rPr>
-                <w:rFonts w:ascii="Arial" w:hAnsi="Arial"/>
-                <w:b w:val="0"/>
-                <w:i w:val="0"/>
-                <w:color w:val="000000"/>
-                <w:sz w:val="18"/>
-              </w:rPr>
-            </w:r>
-          </w:p>
-        </w:tc>
       </w:tr>
       <w:tr>
         <w:tc>
           <w:tcPr>
-            <w:tcW w:type="dxa" w:w="2880"/>
+            <w:tcW w:type="dxa" w:w="4320"/>
           </w:tcPr>
           <w:p>
             <w:r>
@@ -736,7 +510,7 @@
         </w:tc>
         <w:tc>
           <w:tcPr>
-            <w:tcW w:type="dxa" w:w="2880"/>
+            <w:tcW w:type="dxa" w:w="4320"/>
           </w:tcPr>
           <w:p>
             <w:r>
@@ -751,27 +525,11 @@
             </w:r>
           </w:p>
         </w:tc>
-        <w:tc>
-          <w:tcPr>
-            <w:tcW w:type="dxa" w:w="2880"/>
-          </w:tcPr>
-          <w:p>
-            <w:r>
-              <w:rPr>
-                <w:rFonts w:ascii="Arial" w:hAnsi="Arial"/>
-                <w:b w:val="0"/>
-                <w:i w:val="0"/>
-                <w:color w:val="000000"/>
-                <w:sz w:val="18"/>
-              </w:rPr>
-            </w:r>
-          </w:p>
-        </w:tc>
       </w:tr>
       <w:tr>
         <w:tc>
           <w:tcPr>
-            <w:tcW w:type="dxa" w:w="2880"/>
+            <w:tcW w:type="dxa" w:w="4320"/>
           </w:tcPr>
           <w:p>
             <w:r>
@@ -788,7 +546,7 @@
         </w:tc>
         <w:tc>
           <w:tcPr>
-            <w:tcW w:type="dxa" w:w="2880"/>
+            <w:tcW w:type="dxa" w:w="4320"/>
           </w:tcPr>
           <w:p>
             <w:r>
@@ -803,27 +561,11 @@
             </w:r>
           </w:p>
         </w:tc>
-        <w:tc>
-          <w:tcPr>
-            <w:tcW w:type="dxa" w:w="2880"/>
-          </w:tcPr>
-          <w:p>
-            <w:r>
-              <w:rPr>
-                <w:rFonts w:ascii="Arial" w:hAnsi="Arial"/>
-                <w:b w:val="0"/>
-                <w:i w:val="0"/>
-                <w:color w:val="000000"/>
-                <w:sz w:val="18"/>
-              </w:rPr>
-            </w:r>
-          </w:p>
-        </w:tc>
       </w:tr>
       <w:tr>
         <w:tc>
           <w:tcPr>
-            <w:tcW w:type="dxa" w:w="2880"/>
+            <w:tcW w:type="dxa" w:w="4320"/>
           </w:tcPr>
           <w:p>
             <w:r>
@@ -840,7 +582,7 @@
         </w:tc>
         <w:tc>
           <w:tcPr>
-            <w:tcW w:type="dxa" w:w="2880"/>
+            <w:tcW w:type="dxa" w:w="4320"/>
           </w:tcPr>
           <w:p>
             <w:r>
@@ -855,27 +597,11 @@
             </w:r>
           </w:p>
         </w:tc>
-        <w:tc>
-          <w:tcPr>
-            <w:tcW w:type="dxa" w:w="2880"/>
-          </w:tcPr>
-          <w:p>
-            <w:r>
-              <w:rPr>
-                <w:rFonts w:ascii="Arial" w:hAnsi="Arial"/>
-                <w:b w:val="0"/>
-                <w:i w:val="0"/>
-                <w:color w:val="000000"/>
-                <w:sz w:val="18"/>
-              </w:rPr>
-            </w:r>
-          </w:p>
-        </w:tc>
       </w:tr>
       <w:tr>
         <w:tc>
           <w:tcPr>
-            <w:tcW w:type="dxa" w:w="2880"/>
+            <w:tcW w:type="dxa" w:w="4320"/>
           </w:tcPr>
           <w:p>
             <w:r>
@@ -892,7 +618,7 @@
         </w:tc>
         <w:tc>
           <w:tcPr>
-            <w:tcW w:type="dxa" w:w="2880"/>
+            <w:tcW w:type="dxa" w:w="4320"/>
           </w:tcPr>
           <w:p>
             <w:r>
@@ -907,27 +633,11 @@
             </w:r>
           </w:p>
         </w:tc>
-        <w:tc>
-          <w:tcPr>
-            <w:tcW w:type="dxa" w:w="2880"/>
-          </w:tcPr>
-          <w:p>
-            <w:r>
-              <w:rPr>
-                <w:rFonts w:ascii="Arial" w:hAnsi="Arial"/>
-                <w:b w:val="0"/>
-                <w:i w:val="0"/>
-                <w:color w:val="000000"/>
-                <w:sz w:val="18"/>
-              </w:rPr>
-            </w:r>
-          </w:p>
-        </w:tc>
       </w:tr>
       <w:tr>
         <w:tc>
           <w:tcPr>
-            <w:tcW w:type="dxa" w:w="2880"/>
+            <w:tcW w:type="dxa" w:w="4320"/>
           </w:tcPr>
           <w:p>
             <w:r>
@@ -944,7 +654,7 @@
         </w:tc>
         <w:tc>
           <w:tcPr>
-            <w:tcW w:type="dxa" w:w="2880"/>
+            <w:tcW w:type="dxa" w:w="4320"/>
           </w:tcPr>
           <w:p>
             <w:r>
@@ -959,27 +669,11 @@
             </w:r>
           </w:p>
         </w:tc>
-        <w:tc>
-          <w:tcPr>
-            <w:tcW w:type="dxa" w:w="2880"/>
-          </w:tcPr>
-          <w:p>
-            <w:r>
-              <w:rPr>
-                <w:rFonts w:ascii="Arial" w:hAnsi="Arial"/>
-                <w:b w:val="0"/>
-                <w:i w:val="0"/>
-                <w:color w:val="000000"/>
-                <w:sz w:val="18"/>
-              </w:rPr>
-            </w:r>
-          </w:p>
-        </w:tc>
       </w:tr>
       <w:tr>
         <w:tc>
           <w:tcPr>
-            <w:tcW w:type="dxa" w:w="2880"/>
+            <w:tcW w:type="dxa" w:w="4320"/>
           </w:tcPr>
           <w:p>
             <w:r>
@@ -996,7 +690,7 @@
         </w:tc>
         <w:tc>
           <w:tcPr>
-            <w:tcW w:type="dxa" w:w="2880"/>
+            <w:tcW w:type="dxa" w:w="4320"/>
           </w:tcPr>
           <w:p>
             <w:r>
@@ -1011,27 +705,11 @@
             </w:r>
           </w:p>
         </w:tc>
-        <w:tc>
-          <w:tcPr>
-            <w:tcW w:type="dxa" w:w="2880"/>
-          </w:tcPr>
-          <w:p>
-            <w:r>
-              <w:rPr>
-                <w:rFonts w:ascii="Arial" w:hAnsi="Arial"/>
-                <w:b w:val="0"/>
-                <w:i w:val="0"/>
-                <w:color w:val="000000"/>
-                <w:sz w:val="18"/>
-              </w:rPr>
-            </w:r>
-          </w:p>
-        </w:tc>
       </w:tr>
       <w:tr>
         <w:tc>
           <w:tcPr>
-            <w:tcW w:type="dxa" w:w="2880"/>
+            <w:tcW w:type="dxa" w:w="4320"/>
           </w:tcPr>
           <w:p>
             <w:r>
@@ -1048,7 +726,7 @@
         </w:tc>
         <w:tc>
           <w:tcPr>
-            <w:tcW w:type="dxa" w:w="2880"/>
+            <w:tcW w:type="dxa" w:w="4320"/>
           </w:tcPr>
           <w:p>
             <w:r>
@@ -1063,27 +741,11 @@
             </w:r>
           </w:p>
         </w:tc>
-        <w:tc>
-          <w:tcPr>
-            <w:tcW w:type="dxa" w:w="2880"/>
-          </w:tcPr>
-          <w:p>
-            <w:r>
-              <w:rPr>
-                <w:rFonts w:ascii="Arial" w:hAnsi="Arial"/>
-                <w:b w:val="0"/>
-                <w:i w:val="0"/>
-                <w:color w:val="000000"/>
-                <w:sz w:val="18"/>
-              </w:rPr>
-            </w:r>
-          </w:p>
-        </w:tc>
       </w:tr>
       <w:tr>
         <w:tc>
           <w:tcPr>
-            <w:tcW w:type="dxa" w:w="2880"/>
+            <w:tcW w:type="dxa" w:w="4320"/>
           </w:tcPr>
           <w:p>
             <w:r>
@@ -1100,7 +762,7 @@
         </w:tc>
         <w:tc>
           <w:tcPr>
-            <w:tcW w:type="dxa" w:w="2880"/>
+            <w:tcW w:type="dxa" w:w="4320"/>
           </w:tcPr>
           <w:p>
             <w:r>
@@ -1115,27 +777,11 @@
             </w:r>
           </w:p>
         </w:tc>
-        <w:tc>
-          <w:tcPr>
-            <w:tcW w:type="dxa" w:w="2880"/>
-          </w:tcPr>
-          <w:p>
-            <w:r>
-              <w:rPr>
-                <w:rFonts w:ascii="Arial" w:hAnsi="Arial"/>
-                <w:b w:val="0"/>
-                <w:i w:val="0"/>
-                <w:color w:val="000000"/>
-                <w:sz w:val="18"/>
-              </w:rPr>
-            </w:r>
-          </w:p>
-        </w:tc>
       </w:tr>
       <w:tr>
         <w:tc>
           <w:tcPr>
-            <w:tcW w:type="dxa" w:w="2880"/>
+            <w:tcW w:type="dxa" w:w="4320"/>
           </w:tcPr>
           <w:p>
             <w:r>
@@ -1152,7 +798,7 @@
         </w:tc>
         <w:tc>
           <w:tcPr>
-            <w:tcW w:type="dxa" w:w="2880"/>
+            <w:tcW w:type="dxa" w:w="4320"/>
           </w:tcPr>
           <w:p>
             <w:r>
@@ -1167,27 +813,11 @@
             </w:r>
           </w:p>
         </w:tc>
-        <w:tc>
-          <w:tcPr>
-            <w:tcW w:type="dxa" w:w="2880"/>
-          </w:tcPr>
-          <w:p>
-            <w:r>
-              <w:rPr>
-                <w:rFonts w:ascii="Arial" w:hAnsi="Arial"/>
-                <w:b w:val="0"/>
-                <w:i w:val="0"/>
-                <w:color w:val="000000"/>
-                <w:sz w:val="18"/>
-              </w:rPr>
-            </w:r>
-          </w:p>
-        </w:tc>
       </w:tr>
       <w:tr>
         <w:tc>
           <w:tcPr>
-            <w:tcW w:type="dxa" w:w="2880"/>
+            <w:tcW w:type="dxa" w:w="4320"/>
           </w:tcPr>
           <w:p>
             <w:r>
@@ -1204,7 +834,7 @@
         </w:tc>
         <w:tc>
           <w:tcPr>
-            <w:tcW w:type="dxa" w:w="2880"/>
+            <w:tcW w:type="dxa" w:w="4320"/>
           </w:tcPr>
           <w:p>
             <w:r>
@@ -1219,27 +849,11 @@
             </w:r>
           </w:p>
         </w:tc>
-        <w:tc>
-          <w:tcPr>
-            <w:tcW w:type="dxa" w:w="2880"/>
-          </w:tcPr>
-          <w:p>
-            <w:r>
-              <w:rPr>
-                <w:rFonts w:ascii="Arial" w:hAnsi="Arial"/>
-                <w:b w:val="0"/>
-                <w:i w:val="0"/>
-                <w:color w:val="000000"/>
-                <w:sz w:val="18"/>
-              </w:rPr>
-            </w:r>
-          </w:p>
-        </w:tc>
       </w:tr>
       <w:tr>
         <w:tc>
           <w:tcPr>
-            <w:tcW w:type="dxa" w:w="2880"/>
+            <w:tcW w:type="dxa" w:w="4320"/>
           </w:tcPr>
           <w:p>
             <w:r>
@@ -1256,7 +870,7 @@
         </w:tc>
         <w:tc>
           <w:tcPr>
-            <w:tcW w:type="dxa" w:w="2880"/>
+            <w:tcW w:type="dxa" w:w="4320"/>
           </w:tcPr>
           <w:p>
             <w:r>
@@ -1271,27 +885,11 @@
             </w:r>
           </w:p>
         </w:tc>
-        <w:tc>
-          <w:tcPr>
-            <w:tcW w:type="dxa" w:w="2880"/>
-          </w:tcPr>
-          <w:p>
-            <w:r>
-              <w:rPr>
-                <w:rFonts w:ascii="Arial" w:hAnsi="Arial"/>
-                <w:b w:val="0"/>
-                <w:i w:val="0"/>
-                <w:color w:val="000000"/>
-                <w:sz w:val="18"/>
-              </w:rPr>
-            </w:r>
-          </w:p>
-        </w:tc>
       </w:tr>
       <w:tr>
         <w:tc>
           <w:tcPr>
-            <w:tcW w:type="dxa" w:w="2880"/>
+            <w:tcW w:type="dxa" w:w="4320"/>
           </w:tcPr>
           <w:p>
             <w:r>
@@ -1308,7 +906,7 @@
         </w:tc>
         <w:tc>
           <w:tcPr>
-            <w:tcW w:type="dxa" w:w="2880"/>
+            <w:tcW w:type="dxa" w:w="4320"/>
           </w:tcPr>
           <w:p>
             <w:r>
@@ -1323,27 +921,11 @@
             </w:r>
           </w:p>
         </w:tc>
-        <w:tc>
-          <w:tcPr>
-            <w:tcW w:type="dxa" w:w="2880"/>
-          </w:tcPr>
-          <w:p>
-            <w:r>
-              <w:rPr>
-                <w:rFonts w:ascii="Arial" w:hAnsi="Arial"/>
-                <w:b w:val="0"/>
-                <w:i w:val="0"/>
-                <w:color w:val="000000"/>
-                <w:sz w:val="18"/>
-              </w:rPr>
-            </w:r>
-          </w:p>
-        </w:tc>
       </w:tr>
       <w:tr>
         <w:tc>
           <w:tcPr>
-            <w:tcW w:type="dxa" w:w="2880"/>
+            <w:tcW w:type="dxa" w:w="4320"/>
           </w:tcPr>
           <w:p>
             <w:r>
@@ -1360,7 +942,7 @@
         </w:tc>
         <w:tc>
           <w:tcPr>
-            <w:tcW w:type="dxa" w:w="2880"/>
+            <w:tcW w:type="dxa" w:w="4320"/>
           </w:tcPr>
           <w:p>
             <w:r>
@@ -1375,27 +957,11 @@
             </w:r>
           </w:p>
         </w:tc>
-        <w:tc>
-          <w:tcPr>
-            <w:tcW w:type="dxa" w:w="2880"/>
-          </w:tcPr>
-          <w:p>
-            <w:r>
-              <w:rPr>
-                <w:rFonts w:ascii="Arial" w:hAnsi="Arial"/>
-                <w:b w:val="0"/>
-                <w:i w:val="0"/>
-                <w:color w:val="000000"/>
-                <w:sz w:val="18"/>
-              </w:rPr>
-            </w:r>
-          </w:p>
-        </w:tc>
       </w:tr>
       <w:tr>
         <w:tc>
           <w:tcPr>
-            <w:tcW w:type="dxa" w:w="2880"/>
+            <w:tcW w:type="dxa" w:w="4320"/>
           </w:tcPr>
           <w:p>
             <w:r>
@@ -1412,7 +978,7 @@
         </w:tc>
         <w:tc>
           <w:tcPr>
-            <w:tcW w:type="dxa" w:w="2880"/>
+            <w:tcW w:type="dxa" w:w="4320"/>
           </w:tcPr>
           <w:p>
             <w:r>
@@ -1427,27 +993,11 @@
             </w:r>
           </w:p>
         </w:tc>
-        <w:tc>
-          <w:tcPr>
-            <w:tcW w:type="dxa" w:w="2880"/>
-          </w:tcPr>
-          <w:p>
-            <w:r>
-              <w:rPr>
-                <w:rFonts w:ascii="Arial" w:hAnsi="Arial"/>
-                <w:b w:val="0"/>
-                <w:i w:val="0"/>
-                <w:color w:val="000000"/>
-                <w:sz w:val="18"/>
-              </w:rPr>
-            </w:r>
-          </w:p>
-        </w:tc>
       </w:tr>
       <w:tr>
         <w:tc>
           <w:tcPr>
-            <w:tcW w:type="dxa" w:w="2880"/>
+            <w:tcW w:type="dxa" w:w="4320"/>
           </w:tcPr>
           <w:p>
             <w:r>
@@ -1464,7 +1014,7 @@
         </w:tc>
         <w:tc>
           <w:tcPr>
-            <w:tcW w:type="dxa" w:w="2880"/>
+            <w:tcW w:type="dxa" w:w="4320"/>
           </w:tcPr>
           <w:p>
             <w:r>
@@ -1479,27 +1029,11 @@
             </w:r>
           </w:p>
         </w:tc>
-        <w:tc>
-          <w:tcPr>
-            <w:tcW w:type="dxa" w:w="2880"/>
-          </w:tcPr>
-          <w:p>
-            <w:r>
-              <w:rPr>
-                <w:rFonts w:ascii="Arial" w:hAnsi="Arial"/>
-                <w:b w:val="0"/>
-                <w:i w:val="0"/>
-                <w:color w:val="000000"/>
-                <w:sz w:val="18"/>
-              </w:rPr>
-            </w:r>
-          </w:p>
-        </w:tc>
       </w:tr>
       <w:tr>
         <w:tc>
           <w:tcPr>
-            <w:tcW w:type="dxa" w:w="2880"/>
+            <w:tcW w:type="dxa" w:w="4320"/>
           </w:tcPr>
           <w:p>
             <w:r>
@@ -1516,7 +1050,7 @@
         </w:tc>
         <w:tc>
           <w:tcPr>
-            <w:tcW w:type="dxa" w:w="2880"/>
+            <w:tcW w:type="dxa" w:w="4320"/>
           </w:tcPr>
           <w:p>
             <w:r>
@@ -1531,27 +1065,11 @@
             </w:r>
           </w:p>
         </w:tc>
-        <w:tc>
-          <w:tcPr>
-            <w:tcW w:type="dxa" w:w="2880"/>
-          </w:tcPr>
-          <w:p>
-            <w:r>
-              <w:rPr>
-                <w:rFonts w:ascii="Arial" w:hAnsi="Arial"/>
-                <w:b w:val="0"/>
-                <w:i w:val="0"/>
-                <w:color w:val="000000"/>
-                <w:sz w:val="18"/>
-              </w:rPr>
-            </w:r>
-          </w:p>
-        </w:tc>
       </w:tr>
       <w:tr>
         <w:tc>
           <w:tcPr>
-            <w:tcW w:type="dxa" w:w="2880"/>
+            <w:tcW w:type="dxa" w:w="4320"/>
           </w:tcPr>
           <w:p>
             <w:r>
@@ -1568,7 +1086,7 @@
         </w:tc>
         <w:tc>
           <w:tcPr>
-            <w:tcW w:type="dxa" w:w="2880"/>
+            <w:tcW w:type="dxa" w:w="4320"/>
           </w:tcPr>
           <w:p>
             <w:r>
@@ -1583,27 +1101,11 @@
             </w:r>
           </w:p>
         </w:tc>
-        <w:tc>
-          <w:tcPr>
-            <w:tcW w:type="dxa" w:w="2880"/>
-          </w:tcPr>
-          <w:p>
-            <w:r>
-              <w:rPr>
-                <w:rFonts w:ascii="Arial" w:hAnsi="Arial"/>
-                <w:b w:val="0"/>
-                <w:i w:val="0"/>
-                <w:color w:val="000000"/>
-                <w:sz w:val="18"/>
-              </w:rPr>
-            </w:r>
-          </w:p>
-        </w:tc>
       </w:tr>
       <w:tr>
         <w:tc>
           <w:tcPr>
-            <w:tcW w:type="dxa" w:w="2880"/>
+            <w:tcW w:type="dxa" w:w="4320"/>
           </w:tcPr>
           <w:p>
             <w:r>
@@ -1620,7 +1122,7 @@
         </w:tc>
         <w:tc>
           <w:tcPr>
-            <w:tcW w:type="dxa" w:w="2880"/>
+            <w:tcW w:type="dxa" w:w="4320"/>
           </w:tcPr>
           <w:p>
             <w:r>
@@ -1635,27 +1137,11 @@
             </w:r>
           </w:p>
         </w:tc>
-        <w:tc>
-          <w:tcPr>
-            <w:tcW w:type="dxa" w:w="2880"/>
-          </w:tcPr>
-          <w:p>
-            <w:r>
-              <w:rPr>
-                <w:rFonts w:ascii="Arial" w:hAnsi="Arial"/>
-                <w:b w:val="0"/>
-                <w:i w:val="0"/>
-                <w:color w:val="000000"/>
-                <w:sz w:val="18"/>
-              </w:rPr>
-            </w:r>
-          </w:p>
-        </w:tc>
       </w:tr>
       <w:tr>
         <w:tc>
           <w:tcPr>
-            <w:tcW w:type="dxa" w:w="2880"/>
+            <w:tcW w:type="dxa" w:w="4320"/>
           </w:tcPr>
           <w:p>
             <w:r>
@@ -1672,7 +1158,7 @@
         </w:tc>
         <w:tc>
           <w:tcPr>
-            <w:tcW w:type="dxa" w:w="2880"/>
+            <w:tcW w:type="dxa" w:w="4320"/>
           </w:tcPr>
           <w:p>
             <w:r>
@@ -1687,27 +1173,11 @@
             </w:r>
           </w:p>
         </w:tc>
-        <w:tc>
-          <w:tcPr>
-            <w:tcW w:type="dxa" w:w="2880"/>
-          </w:tcPr>
-          <w:p>
-            <w:r>
-              <w:rPr>
-                <w:rFonts w:ascii="Arial" w:hAnsi="Arial"/>
-                <w:b w:val="0"/>
-                <w:i w:val="0"/>
-                <w:color w:val="000000"/>
-                <w:sz w:val="18"/>
-              </w:rPr>
-            </w:r>
-          </w:p>
-        </w:tc>
       </w:tr>
       <w:tr>
         <w:tc>
           <w:tcPr>
-            <w:tcW w:type="dxa" w:w="2880"/>
+            <w:tcW w:type="dxa" w:w="4320"/>
           </w:tcPr>
           <w:p>
             <w:r>
@@ -1724,7 +1194,7 @@
         </w:tc>
         <w:tc>
           <w:tcPr>
-            <w:tcW w:type="dxa" w:w="2880"/>
+            <w:tcW w:type="dxa" w:w="4320"/>
           </w:tcPr>
           <w:p>
             <w:r>
@@ -1739,27 +1209,11 @@
             </w:r>
           </w:p>
         </w:tc>
-        <w:tc>
-          <w:tcPr>
-            <w:tcW w:type="dxa" w:w="2880"/>
-          </w:tcPr>
-          <w:p>
-            <w:r>
-              <w:rPr>
-                <w:rFonts w:ascii="Arial" w:hAnsi="Arial"/>
-                <w:b w:val="0"/>
-                <w:i w:val="0"/>
-                <w:color w:val="000000"/>
-                <w:sz w:val="18"/>
-              </w:rPr>
-            </w:r>
-          </w:p>
-        </w:tc>
       </w:tr>
       <w:tr>
         <w:tc>
           <w:tcPr>
-            <w:tcW w:type="dxa" w:w="2880"/>
+            <w:tcW w:type="dxa" w:w="4320"/>
           </w:tcPr>
           <w:p>
             <w:r>
@@ -1776,7 +1230,7 @@
         </w:tc>
         <w:tc>
           <w:tcPr>
-            <w:tcW w:type="dxa" w:w="2880"/>
+            <w:tcW w:type="dxa" w:w="4320"/>
           </w:tcPr>
           <w:p>
             <w:r>
@@ -1791,27 +1245,11 @@
             </w:r>
           </w:p>
         </w:tc>
-        <w:tc>
-          <w:tcPr>
-            <w:tcW w:type="dxa" w:w="2880"/>
-          </w:tcPr>
-          <w:p>
-            <w:r>
-              <w:rPr>
-                <w:rFonts w:ascii="Arial" w:hAnsi="Arial"/>
-                <w:b w:val="0"/>
-                <w:i w:val="0"/>
-                <w:color w:val="000000"/>
-                <w:sz w:val="18"/>
-              </w:rPr>
-            </w:r>
-          </w:p>
-        </w:tc>
       </w:tr>
       <w:tr>
         <w:tc>
           <w:tcPr>
-            <w:tcW w:type="dxa" w:w="2880"/>
+            <w:tcW w:type="dxa" w:w="4320"/>
           </w:tcPr>
           <w:p>
             <w:r>
@@ -1828,7 +1266,7 @@
         </w:tc>
         <w:tc>
           <w:tcPr>
-            <w:tcW w:type="dxa" w:w="2880"/>
+            <w:tcW w:type="dxa" w:w="4320"/>
           </w:tcPr>
           <w:p>
             <w:r>
@@ -1843,27 +1281,11 @@
             </w:r>
           </w:p>
         </w:tc>
-        <w:tc>
-          <w:tcPr>
-            <w:tcW w:type="dxa" w:w="2880"/>
-          </w:tcPr>
-          <w:p>
-            <w:r>
-              <w:rPr>
-                <w:rFonts w:ascii="Arial" w:hAnsi="Arial"/>
-                <w:b w:val="0"/>
-                <w:i w:val="0"/>
-                <w:color w:val="000000"/>
-                <w:sz w:val="18"/>
-              </w:rPr>
-            </w:r>
-          </w:p>
-        </w:tc>
       </w:tr>
       <w:tr>
         <w:tc>
           <w:tcPr>
-            <w:tcW w:type="dxa" w:w="2880"/>
+            <w:tcW w:type="dxa" w:w="4320"/>
           </w:tcPr>
           <w:p>
             <w:r>
@@ -1880,7 +1302,7 @@
         </w:tc>
         <w:tc>
           <w:tcPr>
-            <w:tcW w:type="dxa" w:w="2880"/>
+            <w:tcW w:type="dxa" w:w="4320"/>
           </w:tcPr>
           <w:p>
             <w:r>
@@ -1895,27 +1317,11 @@
             </w:r>
           </w:p>
         </w:tc>
-        <w:tc>
-          <w:tcPr>
-            <w:tcW w:type="dxa" w:w="2880"/>
-          </w:tcPr>
-          <w:p>
-            <w:r>
-              <w:rPr>
-                <w:rFonts w:ascii="Arial" w:hAnsi="Arial"/>
-                <w:b w:val="0"/>
-                <w:i w:val="0"/>
-                <w:color w:val="000000"/>
-                <w:sz w:val="18"/>
-              </w:rPr>
-            </w:r>
-          </w:p>
-        </w:tc>
       </w:tr>
       <w:tr>
         <w:tc>
           <w:tcPr>
-            <w:tcW w:type="dxa" w:w="2880"/>
+            <w:tcW w:type="dxa" w:w="4320"/>
           </w:tcPr>
           <w:p>
             <w:r>
@@ -1932,7 +1338,7 @@
         </w:tc>
         <w:tc>
           <w:tcPr>
-            <w:tcW w:type="dxa" w:w="2880"/>
+            <w:tcW w:type="dxa" w:w="4320"/>
           </w:tcPr>
           <w:p>
             <w:r>
@@ -1947,27 +1353,11 @@
             </w:r>
           </w:p>
         </w:tc>
-        <w:tc>
-          <w:tcPr>
-            <w:tcW w:type="dxa" w:w="2880"/>
-          </w:tcPr>
-          <w:p>
-            <w:r>
-              <w:rPr>
-                <w:rFonts w:ascii="Arial" w:hAnsi="Arial"/>
-                <w:b w:val="0"/>
-                <w:i w:val="0"/>
-                <w:color w:val="000000"/>
-                <w:sz w:val="18"/>
-              </w:rPr>
-            </w:r>
-          </w:p>
-        </w:tc>
       </w:tr>
       <w:tr>
         <w:tc>
           <w:tcPr>
-            <w:tcW w:type="dxa" w:w="2880"/>
+            <w:tcW w:type="dxa" w:w="4320"/>
           </w:tcPr>
           <w:p>
             <w:r>
@@ -1984,7 +1374,7 @@
         </w:tc>
         <w:tc>
           <w:tcPr>
-            <w:tcW w:type="dxa" w:w="2880"/>
+            <w:tcW w:type="dxa" w:w="4320"/>
           </w:tcPr>
           <w:p>
             <w:r>
@@ -1999,27 +1389,11 @@
             </w:r>
           </w:p>
         </w:tc>
-        <w:tc>
-          <w:tcPr>
-            <w:tcW w:type="dxa" w:w="2880"/>
-          </w:tcPr>
-          <w:p>
-            <w:r>
-              <w:rPr>
-                <w:rFonts w:ascii="Arial" w:hAnsi="Arial"/>
-                <w:b w:val="0"/>
-                <w:i w:val="0"/>
-                <w:color w:val="000000"/>
-                <w:sz w:val="18"/>
-              </w:rPr>
-            </w:r>
-          </w:p>
-        </w:tc>
       </w:tr>
       <w:tr>
         <w:tc>
           <w:tcPr>
-            <w:tcW w:type="dxa" w:w="2880"/>
+            <w:tcW w:type="dxa" w:w="4320"/>
           </w:tcPr>
           <w:p>
             <w:r>
@@ -2036,7 +1410,7 @@
         </w:tc>
         <w:tc>
           <w:tcPr>
-            <w:tcW w:type="dxa" w:w="2880"/>
+            <w:tcW w:type="dxa" w:w="4320"/>
           </w:tcPr>
           <w:p>
             <w:r>
@@ -2051,27 +1425,11 @@
             </w:r>
           </w:p>
         </w:tc>
-        <w:tc>
-          <w:tcPr>
-            <w:tcW w:type="dxa" w:w="2880"/>
-          </w:tcPr>
-          <w:p>
-            <w:r>
-              <w:rPr>
-                <w:rFonts w:ascii="Arial" w:hAnsi="Arial"/>
-                <w:b w:val="0"/>
-                <w:i w:val="0"/>
-                <w:color w:val="000000"/>
-                <w:sz w:val="18"/>
-              </w:rPr>
-            </w:r>
-          </w:p>
-        </w:tc>
       </w:tr>
       <w:tr>
         <w:tc>
           <w:tcPr>
-            <w:tcW w:type="dxa" w:w="2880"/>
+            <w:tcW w:type="dxa" w:w="4320"/>
           </w:tcPr>
           <w:p>
             <w:r>
@@ -2088,7 +1446,7 @@
         </w:tc>
         <w:tc>
           <w:tcPr>
-            <w:tcW w:type="dxa" w:w="2880"/>
+            <w:tcW w:type="dxa" w:w="4320"/>
           </w:tcPr>
           <w:p>
             <w:r>
@@ -2103,27 +1461,11 @@
             </w:r>
           </w:p>
         </w:tc>
-        <w:tc>
-          <w:tcPr>
-            <w:tcW w:type="dxa" w:w="2880"/>
-          </w:tcPr>
-          <w:p>
-            <w:r>
-              <w:rPr>
-                <w:rFonts w:ascii="Arial" w:hAnsi="Arial"/>
-                <w:b w:val="0"/>
-                <w:i w:val="0"/>
-                <w:color w:val="000000"/>
-                <w:sz w:val="18"/>
-              </w:rPr>
-            </w:r>
-          </w:p>
-        </w:tc>
       </w:tr>
       <w:tr>
         <w:tc>
           <w:tcPr>
-            <w:tcW w:type="dxa" w:w="2880"/>
+            <w:tcW w:type="dxa" w:w="4320"/>
           </w:tcPr>
           <w:p>
             <w:r>
@@ -2140,7 +1482,7 @@
         </w:tc>
         <w:tc>
           <w:tcPr>
-            <w:tcW w:type="dxa" w:w="2880"/>
+            <w:tcW w:type="dxa" w:w="4320"/>
           </w:tcPr>
           <w:p>
             <w:r>
@@ -2155,27 +1497,11 @@
             </w:r>
           </w:p>
         </w:tc>
-        <w:tc>
-          <w:tcPr>
-            <w:tcW w:type="dxa" w:w="2880"/>
-          </w:tcPr>
-          <w:p>
-            <w:r>
-              <w:rPr>
-                <w:rFonts w:ascii="Arial" w:hAnsi="Arial"/>
-                <w:b w:val="0"/>
-                <w:i w:val="0"/>
-                <w:color w:val="000000"/>
-                <w:sz w:val="18"/>
-              </w:rPr>
-            </w:r>
-          </w:p>
-        </w:tc>
       </w:tr>
       <w:tr>
         <w:tc>
           <w:tcPr>
-            <w:tcW w:type="dxa" w:w="2880"/>
+            <w:tcW w:type="dxa" w:w="4320"/>
           </w:tcPr>
           <w:p>
             <w:r>
@@ -2192,7 +1518,7 @@
         </w:tc>
         <w:tc>
           <w:tcPr>
-            <w:tcW w:type="dxa" w:w="2880"/>
+            <w:tcW w:type="dxa" w:w="4320"/>
           </w:tcPr>
           <w:p>
             <w:r>
@@ -2207,27 +1533,11 @@
             </w:r>
           </w:p>
         </w:tc>
-        <w:tc>
-          <w:tcPr>
-            <w:tcW w:type="dxa" w:w="2880"/>
-          </w:tcPr>
-          <w:p>
-            <w:r>
-              <w:rPr>
-                <w:rFonts w:ascii="Arial" w:hAnsi="Arial"/>
-                <w:b w:val="0"/>
-                <w:i w:val="0"/>
-                <w:color w:val="000000"/>
-                <w:sz w:val="18"/>
-              </w:rPr>
-            </w:r>
-          </w:p>
-        </w:tc>
       </w:tr>
       <w:tr>
         <w:tc>
           <w:tcPr>
-            <w:tcW w:type="dxa" w:w="2880"/>
+            <w:tcW w:type="dxa" w:w="4320"/>
           </w:tcPr>
           <w:p>
             <w:r>
@@ -2244,7 +1554,7 @@
         </w:tc>
         <w:tc>
           <w:tcPr>
-            <w:tcW w:type="dxa" w:w="2880"/>
+            <w:tcW w:type="dxa" w:w="4320"/>
           </w:tcPr>
           <w:p>
             <w:r>
@@ -2259,27 +1569,11 @@
             </w:r>
           </w:p>
         </w:tc>
-        <w:tc>
-          <w:tcPr>
-            <w:tcW w:type="dxa" w:w="2880"/>
-          </w:tcPr>
-          <w:p>
-            <w:r>
-              <w:rPr>
-                <w:rFonts w:ascii="Arial" w:hAnsi="Arial"/>
-                <w:b w:val="0"/>
-                <w:i w:val="0"/>
-                <w:color w:val="000000"/>
-                <w:sz w:val="18"/>
-              </w:rPr>
-            </w:r>
-          </w:p>
-        </w:tc>
       </w:tr>
       <w:tr>
         <w:tc>
           <w:tcPr>
-            <w:tcW w:type="dxa" w:w="2880"/>
+            <w:tcW w:type="dxa" w:w="4320"/>
           </w:tcPr>
           <w:p>
             <w:r>
@@ -2296,7 +1590,7 @@
         </w:tc>
         <w:tc>
           <w:tcPr>
-            <w:tcW w:type="dxa" w:w="2880"/>
+            <w:tcW w:type="dxa" w:w="4320"/>
           </w:tcPr>
           <w:p>
             <w:r>
@@ -2311,27 +1605,11 @@
             </w:r>
           </w:p>
         </w:tc>
-        <w:tc>
-          <w:tcPr>
-            <w:tcW w:type="dxa" w:w="2880"/>
-          </w:tcPr>
-          <w:p>
-            <w:r>
-              <w:rPr>
-                <w:rFonts w:ascii="Arial" w:hAnsi="Arial"/>
-                <w:b w:val="0"/>
-                <w:i w:val="0"/>
-                <w:color w:val="000000"/>
-                <w:sz w:val="18"/>
-              </w:rPr>
-            </w:r>
-          </w:p>
-        </w:tc>
       </w:tr>
       <w:tr>
         <w:tc>
           <w:tcPr>
-            <w:tcW w:type="dxa" w:w="2880"/>
+            <w:tcW w:type="dxa" w:w="4320"/>
           </w:tcPr>
           <w:p>
             <w:r>
@@ -2348,7 +1626,7 @@
         </w:tc>
         <w:tc>
           <w:tcPr>
-            <w:tcW w:type="dxa" w:w="2880"/>
+            <w:tcW w:type="dxa" w:w="4320"/>
           </w:tcPr>
           <w:p>
             <w:r>
@@ -2363,27 +1641,11 @@
             </w:r>
           </w:p>
         </w:tc>
-        <w:tc>
-          <w:tcPr>
-            <w:tcW w:type="dxa" w:w="2880"/>
-          </w:tcPr>
-          <w:p>
-            <w:r>
-              <w:rPr>
-                <w:rFonts w:ascii="Arial" w:hAnsi="Arial"/>
-                <w:b w:val="0"/>
-                <w:i w:val="0"/>
-                <w:color w:val="000000"/>
-                <w:sz w:val="18"/>
-              </w:rPr>
-            </w:r>
-          </w:p>
-        </w:tc>
       </w:tr>
       <w:tr>
         <w:tc>
           <w:tcPr>
-            <w:tcW w:type="dxa" w:w="2880"/>
+            <w:tcW w:type="dxa" w:w="4320"/>
           </w:tcPr>
           <w:p>
             <w:r>
@@ -2400,7 +1662,7 @@
         </w:tc>
         <w:tc>
           <w:tcPr>
-            <w:tcW w:type="dxa" w:w="2880"/>
+            <w:tcW w:type="dxa" w:w="4320"/>
           </w:tcPr>
           <w:p>
             <w:r>
@@ -2415,27 +1677,11 @@
             </w:r>
           </w:p>
         </w:tc>
-        <w:tc>
-          <w:tcPr>
-            <w:tcW w:type="dxa" w:w="2880"/>
-          </w:tcPr>
-          <w:p>
-            <w:r>
-              <w:rPr>
-                <w:rFonts w:ascii="Arial" w:hAnsi="Arial"/>
-                <w:b w:val="0"/>
-                <w:i w:val="0"/>
-                <w:color w:val="000000"/>
-                <w:sz w:val="18"/>
-              </w:rPr>
-            </w:r>
-          </w:p>
-        </w:tc>
       </w:tr>
       <w:tr>
         <w:tc>
           <w:tcPr>
-            <w:tcW w:type="dxa" w:w="2880"/>
+            <w:tcW w:type="dxa" w:w="4320"/>
           </w:tcPr>
           <w:p>
             <w:r>
@@ -2452,7 +1698,7 @@
         </w:tc>
         <w:tc>
           <w:tcPr>
-            <w:tcW w:type="dxa" w:w="2880"/>
+            <w:tcW w:type="dxa" w:w="4320"/>
           </w:tcPr>
           <w:p>
             <w:r>
@@ -2467,27 +1713,11 @@
             </w:r>
           </w:p>
         </w:tc>
-        <w:tc>
-          <w:tcPr>
-            <w:tcW w:type="dxa" w:w="2880"/>
-          </w:tcPr>
-          <w:p>
-            <w:r>
-              <w:rPr>
-                <w:rFonts w:ascii="Arial" w:hAnsi="Arial"/>
-                <w:b w:val="0"/>
-                <w:i w:val="0"/>
-                <w:color w:val="000000"/>
-                <w:sz w:val="18"/>
-              </w:rPr>
-            </w:r>
-          </w:p>
-        </w:tc>
       </w:tr>
       <w:tr>
         <w:tc>
           <w:tcPr>
-            <w:tcW w:type="dxa" w:w="2880"/>
+            <w:tcW w:type="dxa" w:w="4320"/>
           </w:tcPr>
           <w:p>
             <w:r>
@@ -2504,7 +1734,7 @@
         </w:tc>
         <w:tc>
           <w:tcPr>
-            <w:tcW w:type="dxa" w:w="2880"/>
+            <w:tcW w:type="dxa" w:w="4320"/>
           </w:tcPr>
           <w:p>
             <w:r>
@@ -2519,27 +1749,11 @@
             </w:r>
           </w:p>
         </w:tc>
-        <w:tc>
-          <w:tcPr>
-            <w:tcW w:type="dxa" w:w="2880"/>
-          </w:tcPr>
-          <w:p>
-            <w:r>
-              <w:rPr>
-                <w:rFonts w:ascii="Arial" w:hAnsi="Arial"/>
-                <w:b w:val="0"/>
-                <w:i w:val="0"/>
-                <w:color w:val="000000"/>
-                <w:sz w:val="18"/>
-              </w:rPr>
-            </w:r>
-          </w:p>
-        </w:tc>
       </w:tr>
       <w:tr>
         <w:tc>
           <w:tcPr>
-            <w:tcW w:type="dxa" w:w="2880"/>
+            <w:tcW w:type="dxa" w:w="4320"/>
           </w:tcPr>
           <w:p>
             <w:r>
@@ -2556,7 +1770,7 @@
         </w:tc>
         <w:tc>
           <w:tcPr>
-            <w:tcW w:type="dxa" w:w="2880"/>
+            <w:tcW w:type="dxa" w:w="4320"/>
           </w:tcPr>
           <w:p>
             <w:r>
@@ -2571,27 +1785,11 @@
             </w:r>
           </w:p>
         </w:tc>
-        <w:tc>
-          <w:tcPr>
-            <w:tcW w:type="dxa" w:w="2880"/>
-          </w:tcPr>
-          <w:p>
-            <w:r>
-              <w:rPr>
-                <w:rFonts w:ascii="Arial" w:hAnsi="Arial"/>
-                <w:b w:val="0"/>
-                <w:i w:val="0"/>
-                <w:color w:val="000000"/>
-                <w:sz w:val="18"/>
-              </w:rPr>
-            </w:r>
-          </w:p>
-        </w:tc>
       </w:tr>
       <w:tr>
         <w:tc>
           <w:tcPr>
-            <w:tcW w:type="dxa" w:w="2880"/>
+            <w:tcW w:type="dxa" w:w="4320"/>
           </w:tcPr>
           <w:p>
             <w:r>
@@ -2608,7 +1806,7 @@
         </w:tc>
         <w:tc>
           <w:tcPr>
-            <w:tcW w:type="dxa" w:w="2880"/>
+            <w:tcW w:type="dxa" w:w="4320"/>
           </w:tcPr>
           <w:p>
             <w:r>
@@ -2623,27 +1821,11 @@
             </w:r>
           </w:p>
         </w:tc>
-        <w:tc>
-          <w:tcPr>
-            <w:tcW w:type="dxa" w:w="2880"/>
-          </w:tcPr>
-          <w:p>
-            <w:r>
-              <w:rPr>
-                <w:rFonts w:ascii="Arial" w:hAnsi="Arial"/>
-                <w:b w:val="0"/>
-                <w:i w:val="0"/>
-                <w:color w:val="000000"/>
-                <w:sz w:val="18"/>
-              </w:rPr>
-            </w:r>
-          </w:p>
-        </w:tc>
       </w:tr>
       <w:tr>
         <w:tc>
           <w:tcPr>
-            <w:tcW w:type="dxa" w:w="2880"/>
+            <w:tcW w:type="dxa" w:w="4320"/>
           </w:tcPr>
           <w:p>
             <w:r>
@@ -2660,7 +1842,7 @@
         </w:tc>
         <w:tc>
           <w:tcPr>
-            <w:tcW w:type="dxa" w:w="2880"/>
+            <w:tcW w:type="dxa" w:w="4320"/>
           </w:tcPr>
           <w:p>
             <w:r>
@@ -2675,27 +1857,11 @@
             </w:r>
           </w:p>
         </w:tc>
-        <w:tc>
-          <w:tcPr>
-            <w:tcW w:type="dxa" w:w="2880"/>
-          </w:tcPr>
-          <w:p>
-            <w:r>
-              <w:rPr>
-                <w:rFonts w:ascii="Arial" w:hAnsi="Arial"/>
-                <w:b w:val="0"/>
-                <w:i w:val="0"/>
-                <w:color w:val="000000"/>
-                <w:sz w:val="18"/>
-              </w:rPr>
-            </w:r>
-          </w:p>
-        </w:tc>
       </w:tr>
       <w:tr>
         <w:tc>
           <w:tcPr>
-            <w:tcW w:type="dxa" w:w="2880"/>
+            <w:tcW w:type="dxa" w:w="4320"/>
           </w:tcPr>
           <w:p>
             <w:r>
@@ -2712,7 +1878,7 @@
         </w:tc>
         <w:tc>
           <w:tcPr>
-            <w:tcW w:type="dxa" w:w="2880"/>
+            <w:tcW w:type="dxa" w:w="4320"/>
           </w:tcPr>
           <w:p>
             <w:r>
@@ -2727,27 +1893,11 @@
             </w:r>
           </w:p>
         </w:tc>
-        <w:tc>
-          <w:tcPr>
-            <w:tcW w:type="dxa" w:w="2880"/>
-          </w:tcPr>
-          <w:p>
-            <w:r>
-              <w:rPr>
-                <w:rFonts w:ascii="Arial" w:hAnsi="Arial"/>
-                <w:b w:val="0"/>
-                <w:i w:val="0"/>
-                <w:color w:val="000000"/>
-                <w:sz w:val="18"/>
-              </w:rPr>
-            </w:r>
-          </w:p>
-        </w:tc>
       </w:tr>
       <w:tr>
         <w:tc>
           <w:tcPr>
-            <w:tcW w:type="dxa" w:w="2880"/>
+            <w:tcW w:type="dxa" w:w="4320"/>
           </w:tcPr>
           <w:p>
             <w:r>
@@ -2764,7 +1914,7 @@
         </w:tc>
         <w:tc>
           <w:tcPr>
-            <w:tcW w:type="dxa" w:w="2880"/>
+            <w:tcW w:type="dxa" w:w="4320"/>
           </w:tcPr>
           <w:p>
             <w:r>
@@ -2779,27 +1929,11 @@
             </w:r>
           </w:p>
         </w:tc>
-        <w:tc>
-          <w:tcPr>
-            <w:tcW w:type="dxa" w:w="2880"/>
-          </w:tcPr>
-          <w:p>
-            <w:r>
-              <w:rPr>
-                <w:rFonts w:ascii="Arial" w:hAnsi="Arial"/>
-                <w:b w:val="0"/>
-                <w:i w:val="0"/>
-                <w:color w:val="000000"/>
-                <w:sz w:val="18"/>
-              </w:rPr>
-            </w:r>
-          </w:p>
-        </w:tc>
       </w:tr>
       <w:tr>
         <w:tc>
           <w:tcPr>
-            <w:tcW w:type="dxa" w:w="2880"/>
+            <w:tcW w:type="dxa" w:w="4320"/>
           </w:tcPr>
           <w:p>
             <w:r>
@@ -2816,7 +1950,7 @@
         </w:tc>
         <w:tc>
           <w:tcPr>
-            <w:tcW w:type="dxa" w:w="2880"/>
+            <w:tcW w:type="dxa" w:w="4320"/>
           </w:tcPr>
           <w:p>
             <w:r>
@@ -2831,27 +1965,11 @@
             </w:r>
           </w:p>
         </w:tc>
-        <w:tc>
-          <w:tcPr>
-            <w:tcW w:type="dxa" w:w="2880"/>
-          </w:tcPr>
-          <w:p>
-            <w:r>
-              <w:rPr>
-                <w:rFonts w:ascii="Arial" w:hAnsi="Arial"/>
-                <w:b w:val="0"/>
-                <w:i w:val="0"/>
-                <w:color w:val="000000"/>
-                <w:sz w:val="18"/>
-              </w:rPr>
-            </w:r>
-          </w:p>
-        </w:tc>
       </w:tr>
       <w:tr>
         <w:tc>
           <w:tcPr>
-            <w:tcW w:type="dxa" w:w="2880"/>
+            <w:tcW w:type="dxa" w:w="4320"/>
           </w:tcPr>
           <w:p>
             <w:r>
@@ -2868,7 +1986,7 @@
         </w:tc>
         <w:tc>
           <w:tcPr>
-            <w:tcW w:type="dxa" w:w="2880"/>
+            <w:tcW w:type="dxa" w:w="4320"/>
           </w:tcPr>
           <w:p>
             <w:r>
@@ -2883,27 +2001,11 @@
             </w:r>
           </w:p>
         </w:tc>
-        <w:tc>
-          <w:tcPr>
-            <w:tcW w:type="dxa" w:w="2880"/>
-          </w:tcPr>
-          <w:p>
-            <w:r>
-              <w:rPr>
-                <w:rFonts w:ascii="Arial" w:hAnsi="Arial"/>
-                <w:b w:val="0"/>
-                <w:i w:val="0"/>
-                <w:color w:val="000000"/>
-                <w:sz w:val="18"/>
-              </w:rPr>
-            </w:r>
-          </w:p>
-        </w:tc>
       </w:tr>
       <w:tr>
         <w:tc>
           <w:tcPr>
-            <w:tcW w:type="dxa" w:w="2880"/>
+            <w:tcW w:type="dxa" w:w="4320"/>
           </w:tcPr>
           <w:p>
             <w:r>
@@ -2920,7 +2022,7 @@
         </w:tc>
         <w:tc>
           <w:tcPr>
-            <w:tcW w:type="dxa" w:w="2880"/>
+            <w:tcW w:type="dxa" w:w="4320"/>
           </w:tcPr>
           <w:p>
             <w:r>
@@ -2935,27 +2037,11 @@
             </w:r>
           </w:p>
         </w:tc>
-        <w:tc>
-          <w:tcPr>
-            <w:tcW w:type="dxa" w:w="2880"/>
-          </w:tcPr>
-          <w:p>
-            <w:r>
-              <w:rPr>
-                <w:rFonts w:ascii="Arial" w:hAnsi="Arial"/>
-                <w:b w:val="0"/>
-                <w:i w:val="0"/>
-                <w:color w:val="000000"/>
-                <w:sz w:val="18"/>
-              </w:rPr>
-            </w:r>
-          </w:p>
-        </w:tc>
       </w:tr>
       <w:tr>
         <w:tc>
           <w:tcPr>
-            <w:tcW w:type="dxa" w:w="2880"/>
+            <w:tcW w:type="dxa" w:w="4320"/>
           </w:tcPr>
           <w:p>
             <w:r>
@@ -2972,7 +2058,7 @@
         </w:tc>
         <w:tc>
           <w:tcPr>
-            <w:tcW w:type="dxa" w:w="2880"/>
+            <w:tcW w:type="dxa" w:w="4320"/>
           </w:tcPr>
           <w:p>
             <w:r>
@@ -2987,27 +2073,11 @@
             </w:r>
           </w:p>
         </w:tc>
-        <w:tc>
-          <w:tcPr>
-            <w:tcW w:type="dxa" w:w="2880"/>
-          </w:tcPr>
-          <w:p>
-            <w:r>
-              <w:rPr>
-                <w:rFonts w:ascii="Arial" w:hAnsi="Arial"/>
-                <w:b w:val="0"/>
-                <w:i w:val="0"/>
-                <w:color w:val="000000"/>
-                <w:sz w:val="18"/>
-              </w:rPr>
-            </w:r>
-          </w:p>
-        </w:tc>
       </w:tr>
       <w:tr>
         <w:tc>
           <w:tcPr>
-            <w:tcW w:type="dxa" w:w="2880"/>
+            <w:tcW w:type="dxa" w:w="4320"/>
           </w:tcPr>
           <w:p>
             <w:r>
@@ -3024,7 +2094,7 @@
         </w:tc>
         <w:tc>
           <w:tcPr>
-            <w:tcW w:type="dxa" w:w="2880"/>
+            <w:tcW w:type="dxa" w:w="4320"/>
           </w:tcPr>
           <w:p>
             <w:r>
@@ -3039,27 +2109,11 @@
             </w:r>
           </w:p>
         </w:tc>
-        <w:tc>
-          <w:tcPr>
-            <w:tcW w:type="dxa" w:w="2880"/>
-          </w:tcPr>
-          <w:p>
-            <w:r>
-              <w:rPr>
-                <w:rFonts w:ascii="Arial" w:hAnsi="Arial"/>
-                <w:b w:val="0"/>
-                <w:i w:val="0"/>
-                <w:color w:val="000000"/>
-                <w:sz w:val="18"/>
-              </w:rPr>
-            </w:r>
-          </w:p>
-        </w:tc>
       </w:tr>
       <w:tr>
         <w:tc>
           <w:tcPr>
-            <w:tcW w:type="dxa" w:w="2880"/>
+            <w:tcW w:type="dxa" w:w="4320"/>
           </w:tcPr>
           <w:p>
             <w:r>
@@ -3076,7 +2130,7 @@
         </w:tc>
         <w:tc>
           <w:tcPr>
-            <w:tcW w:type="dxa" w:w="2880"/>
+            <w:tcW w:type="dxa" w:w="4320"/>
           </w:tcPr>
           <w:p>
             <w:r>
@@ -3091,27 +2145,11 @@
             </w:r>
           </w:p>
         </w:tc>
-        <w:tc>
-          <w:tcPr>
-            <w:tcW w:type="dxa" w:w="2880"/>
-          </w:tcPr>
-          <w:p>
-            <w:r>
-              <w:rPr>
-                <w:rFonts w:ascii="Arial" w:hAnsi="Arial"/>
-                <w:b w:val="0"/>
-                <w:i w:val="0"/>
-                <w:color w:val="000000"/>
-                <w:sz w:val="18"/>
-              </w:rPr>
-            </w:r>
-          </w:p>
-        </w:tc>
       </w:tr>
       <w:tr>
         <w:tc>
           <w:tcPr>
-            <w:tcW w:type="dxa" w:w="2880"/>
+            <w:tcW w:type="dxa" w:w="4320"/>
           </w:tcPr>
           <w:p>
             <w:r>
@@ -3128,7 +2166,7 @@
         </w:tc>
         <w:tc>
           <w:tcPr>
-            <w:tcW w:type="dxa" w:w="2880"/>
+            <w:tcW w:type="dxa" w:w="4320"/>
           </w:tcPr>
           <w:p>
             <w:r>
@@ -3143,27 +2181,11 @@
             </w:r>
           </w:p>
         </w:tc>
-        <w:tc>
-          <w:tcPr>
-            <w:tcW w:type="dxa" w:w="2880"/>
-          </w:tcPr>
-          <w:p>
-            <w:r>
-              <w:rPr>
-                <w:rFonts w:ascii="Arial" w:hAnsi="Arial"/>
-                <w:b w:val="0"/>
-                <w:i w:val="0"/>
-                <w:color w:val="000000"/>
-                <w:sz w:val="18"/>
-              </w:rPr>
-            </w:r>
-          </w:p>
-        </w:tc>
       </w:tr>
       <w:tr>
         <w:tc>
           <w:tcPr>
-            <w:tcW w:type="dxa" w:w="2880"/>
+            <w:tcW w:type="dxa" w:w="4320"/>
           </w:tcPr>
           <w:p>
             <w:r>
@@ -3180,7 +2202,7 @@
         </w:tc>
         <w:tc>
           <w:tcPr>
-            <w:tcW w:type="dxa" w:w="2880"/>
+            <w:tcW w:type="dxa" w:w="4320"/>
           </w:tcPr>
           <w:p>
             <w:r>
@@ -3195,27 +2217,11 @@
             </w:r>
           </w:p>
         </w:tc>
-        <w:tc>
-          <w:tcPr>
-            <w:tcW w:type="dxa" w:w="2880"/>
-          </w:tcPr>
-          <w:p>
-            <w:r>
-              <w:rPr>
-                <w:rFonts w:ascii="Arial" w:hAnsi="Arial"/>
-                <w:b w:val="0"/>
-                <w:i w:val="0"/>
-                <w:color w:val="000000"/>
-                <w:sz w:val="18"/>
-              </w:rPr>
-            </w:r>
-          </w:p>
-        </w:tc>
       </w:tr>
       <w:tr>
         <w:tc>
           <w:tcPr>
-            <w:tcW w:type="dxa" w:w="2880"/>
+            <w:tcW w:type="dxa" w:w="4320"/>
           </w:tcPr>
           <w:p>
             <w:r>
@@ -3232,7 +2238,7 @@
         </w:tc>
         <w:tc>
           <w:tcPr>
-            <w:tcW w:type="dxa" w:w="2880"/>
+            <w:tcW w:type="dxa" w:w="4320"/>
           </w:tcPr>
           <w:p>
             <w:r>
@@ -3247,27 +2253,11 @@
             </w:r>
           </w:p>
         </w:tc>
-        <w:tc>
-          <w:tcPr>
-            <w:tcW w:type="dxa" w:w="2880"/>
-          </w:tcPr>
-          <w:p>
-            <w:r>
-              <w:rPr>
-                <w:rFonts w:ascii="Arial" w:hAnsi="Arial"/>
-                <w:b w:val="0"/>
-                <w:i w:val="0"/>
-                <w:color w:val="000000"/>
-                <w:sz w:val="18"/>
-              </w:rPr>
-            </w:r>
-          </w:p>
-        </w:tc>
       </w:tr>
       <w:tr>
         <w:tc>
           <w:tcPr>
-            <w:tcW w:type="dxa" w:w="2880"/>
+            <w:tcW w:type="dxa" w:w="4320"/>
           </w:tcPr>
           <w:p>
             <w:r>
@@ -3284,7 +2274,7 @@
         </w:tc>
         <w:tc>
           <w:tcPr>
-            <w:tcW w:type="dxa" w:w="2880"/>
+            <w:tcW w:type="dxa" w:w="4320"/>
           </w:tcPr>
           <w:p>
             <w:r>
@@ -3299,27 +2289,11 @@
             </w:r>
           </w:p>
         </w:tc>
-        <w:tc>
-          <w:tcPr>
-            <w:tcW w:type="dxa" w:w="2880"/>
-          </w:tcPr>
-          <w:p>
-            <w:r>
-              <w:rPr>
-                <w:rFonts w:ascii="Arial" w:hAnsi="Arial"/>
-                <w:b w:val="0"/>
-                <w:i w:val="0"/>
-                <w:color w:val="000000"/>
-                <w:sz w:val="18"/>
-              </w:rPr>
-            </w:r>
-          </w:p>
-        </w:tc>
       </w:tr>
       <w:tr>
         <w:tc>
           <w:tcPr>
-            <w:tcW w:type="dxa" w:w="2880"/>
+            <w:tcW w:type="dxa" w:w="4320"/>
           </w:tcPr>
           <w:p>
             <w:r>
@@ -3336,7 +2310,7 @@
         </w:tc>
         <w:tc>
           <w:tcPr>
-            <w:tcW w:type="dxa" w:w="2880"/>
+            <w:tcW w:type="dxa" w:w="4320"/>
           </w:tcPr>
           <w:p>
             <w:r>
@@ -3351,27 +2325,11 @@
             </w:r>
           </w:p>
         </w:tc>
-        <w:tc>
-          <w:tcPr>
-            <w:tcW w:type="dxa" w:w="2880"/>
-          </w:tcPr>
-          <w:p>
-            <w:r>
-              <w:rPr>
-                <w:rFonts w:ascii="Arial" w:hAnsi="Arial"/>
-                <w:b w:val="0"/>
-                <w:i w:val="0"/>
-                <w:color w:val="000000"/>
-                <w:sz w:val="18"/>
-              </w:rPr>
-            </w:r>
-          </w:p>
-        </w:tc>
       </w:tr>
       <w:tr>
         <w:tc>
           <w:tcPr>
-            <w:tcW w:type="dxa" w:w="2880"/>
+            <w:tcW w:type="dxa" w:w="4320"/>
           </w:tcPr>
           <w:p>
             <w:r>
@@ -3388,7 +2346,7 @@
         </w:tc>
         <w:tc>
           <w:tcPr>
-            <w:tcW w:type="dxa" w:w="2880"/>
+            <w:tcW w:type="dxa" w:w="4320"/>
           </w:tcPr>
           <w:p>
             <w:r>
@@ -3403,27 +2361,11 @@
             </w:r>
           </w:p>
         </w:tc>
-        <w:tc>
-          <w:tcPr>
-            <w:tcW w:type="dxa" w:w="2880"/>
-          </w:tcPr>
-          <w:p>
-            <w:r>
-              <w:rPr>
-                <w:rFonts w:ascii="Arial" w:hAnsi="Arial"/>
-                <w:b w:val="0"/>
-                <w:i w:val="0"/>
-                <w:color w:val="000000"/>
-                <w:sz w:val="18"/>
-              </w:rPr>
-            </w:r>
-          </w:p>
-        </w:tc>
       </w:tr>
       <w:tr>
         <w:tc>
           <w:tcPr>
-            <w:tcW w:type="dxa" w:w="2880"/>
+            <w:tcW w:type="dxa" w:w="4320"/>
           </w:tcPr>
           <w:p>
             <w:r>
@@ -3440,7 +2382,7 @@
         </w:tc>
         <w:tc>
           <w:tcPr>
-            <w:tcW w:type="dxa" w:w="2880"/>
+            <w:tcW w:type="dxa" w:w="4320"/>
           </w:tcPr>
           <w:p>
             <w:r>
@@ -3455,27 +2397,11 @@
             </w:r>
           </w:p>
         </w:tc>
-        <w:tc>
-          <w:tcPr>
-            <w:tcW w:type="dxa" w:w="2880"/>
-          </w:tcPr>
-          <w:p>
-            <w:r>
-              <w:rPr>
-                <w:rFonts w:ascii="Arial" w:hAnsi="Arial"/>
-                <w:b w:val="0"/>
-                <w:i w:val="0"/>
-                <w:color w:val="000000"/>
-                <w:sz w:val="18"/>
-              </w:rPr>
-            </w:r>
-          </w:p>
-        </w:tc>
       </w:tr>
       <w:tr>
         <w:tc>
           <w:tcPr>
-            <w:tcW w:type="dxa" w:w="2880"/>
+            <w:tcW w:type="dxa" w:w="4320"/>
           </w:tcPr>
           <w:p>
             <w:r>
@@ -3492,7 +2418,7 @@
         </w:tc>
         <w:tc>
           <w:tcPr>
-            <w:tcW w:type="dxa" w:w="2880"/>
+            <w:tcW w:type="dxa" w:w="4320"/>
           </w:tcPr>
           <w:p>
             <w:r>
@@ -3507,27 +2433,11 @@
             </w:r>
           </w:p>
         </w:tc>
-        <w:tc>
-          <w:tcPr>
-            <w:tcW w:type="dxa" w:w="2880"/>
-          </w:tcPr>
-          <w:p>
-            <w:r>
-              <w:rPr>
-                <w:rFonts w:ascii="Arial" w:hAnsi="Arial"/>
-                <w:b w:val="0"/>
-                <w:i w:val="0"/>
-                <w:color w:val="000000"/>
-                <w:sz w:val="18"/>
-              </w:rPr>
-            </w:r>
-          </w:p>
-        </w:tc>
       </w:tr>
       <w:tr>
         <w:tc>
           <w:tcPr>
-            <w:tcW w:type="dxa" w:w="2880"/>
+            <w:tcW w:type="dxa" w:w="4320"/>
           </w:tcPr>
           <w:p>
             <w:r>
@@ -3544,7 +2454,7 @@
         </w:tc>
         <w:tc>
           <w:tcPr>
-            <w:tcW w:type="dxa" w:w="2880"/>
+            <w:tcW w:type="dxa" w:w="4320"/>
           </w:tcPr>
           <w:p>
             <w:r>
@@ -3559,27 +2469,11 @@
             </w:r>
           </w:p>
         </w:tc>
-        <w:tc>
-          <w:tcPr>
-            <w:tcW w:type="dxa" w:w="2880"/>
-          </w:tcPr>
-          <w:p>
-            <w:r>
-              <w:rPr>
-                <w:rFonts w:ascii="Arial" w:hAnsi="Arial"/>
-                <w:b w:val="0"/>
-                <w:i w:val="0"/>
-                <w:color w:val="000000"/>
-                <w:sz w:val="18"/>
-              </w:rPr>
-            </w:r>
-          </w:p>
-        </w:tc>
       </w:tr>
       <w:tr>
         <w:tc>
           <w:tcPr>
-            <w:tcW w:type="dxa" w:w="2880"/>
+            <w:tcW w:type="dxa" w:w="4320"/>
           </w:tcPr>
           <w:p>
             <w:r>
@@ -3596,7 +2490,7 @@
         </w:tc>
         <w:tc>
           <w:tcPr>
-            <w:tcW w:type="dxa" w:w="2880"/>
+            <w:tcW w:type="dxa" w:w="4320"/>
           </w:tcPr>
           <w:p>
             <w:r>
@@ -3611,27 +2505,11 @@
             </w:r>
           </w:p>
         </w:tc>
-        <w:tc>
-          <w:tcPr>
-            <w:tcW w:type="dxa" w:w="2880"/>
-          </w:tcPr>
-          <w:p>
-            <w:r>
-              <w:rPr>
-                <w:rFonts w:ascii="Arial" w:hAnsi="Arial"/>
-                <w:b w:val="0"/>
-                <w:i w:val="0"/>
-                <w:color w:val="000000"/>
-                <w:sz w:val="18"/>
-              </w:rPr>
-            </w:r>
-          </w:p>
-        </w:tc>
       </w:tr>
       <w:tr>
         <w:tc>
           <w:tcPr>
-            <w:tcW w:type="dxa" w:w="2880"/>
+            <w:tcW w:type="dxa" w:w="4320"/>
           </w:tcPr>
           <w:p>
             <w:r>
@@ -3648,7 +2526,7 @@
         </w:tc>
         <w:tc>
           <w:tcPr>
-            <w:tcW w:type="dxa" w:w="2880"/>
+            <w:tcW w:type="dxa" w:w="4320"/>
           </w:tcPr>
           <w:p>
             <w:r>
@@ -3663,27 +2541,11 @@
             </w:r>
           </w:p>
         </w:tc>
-        <w:tc>
-          <w:tcPr>
-            <w:tcW w:type="dxa" w:w="2880"/>
-          </w:tcPr>
-          <w:p>
-            <w:r>
-              <w:rPr>
-                <w:rFonts w:ascii="Arial" w:hAnsi="Arial"/>
-                <w:b w:val="0"/>
-                <w:i w:val="0"/>
-                <w:color w:val="000000"/>
-                <w:sz w:val="18"/>
-              </w:rPr>
-            </w:r>
-          </w:p>
-        </w:tc>
       </w:tr>
       <w:tr>
         <w:tc>
           <w:tcPr>
-            <w:tcW w:type="dxa" w:w="2880"/>
+            <w:tcW w:type="dxa" w:w="4320"/>
           </w:tcPr>
           <w:p>
             <w:r>
@@ -3700,7 +2562,7 @@
         </w:tc>
         <w:tc>
           <w:tcPr>
-            <w:tcW w:type="dxa" w:w="2880"/>
+            <w:tcW w:type="dxa" w:w="4320"/>
           </w:tcPr>
           <w:p>
             <w:r>
@@ -3715,27 +2577,11 @@
             </w:r>
           </w:p>
         </w:tc>
-        <w:tc>
-          <w:tcPr>
-            <w:tcW w:type="dxa" w:w="2880"/>
-          </w:tcPr>
-          <w:p>
-            <w:r>
-              <w:rPr>
-                <w:rFonts w:ascii="Arial" w:hAnsi="Arial"/>
-                <w:b w:val="0"/>
-                <w:i w:val="0"/>
-                <w:color w:val="000000"/>
-                <w:sz w:val="18"/>
-              </w:rPr>
-            </w:r>
-          </w:p>
-        </w:tc>
       </w:tr>
       <w:tr>
         <w:tc>
           <w:tcPr>
-            <w:tcW w:type="dxa" w:w="2880"/>
+            <w:tcW w:type="dxa" w:w="4320"/>
           </w:tcPr>
           <w:p>
             <w:r>
@@ -3752,7 +2598,7 @@
         </w:tc>
         <w:tc>
           <w:tcPr>
-            <w:tcW w:type="dxa" w:w="2880"/>
+            <w:tcW w:type="dxa" w:w="4320"/>
           </w:tcPr>
           <w:p>
             <w:r>
@@ -3767,27 +2613,11 @@
             </w:r>
           </w:p>
         </w:tc>
-        <w:tc>
-          <w:tcPr>
-            <w:tcW w:type="dxa" w:w="2880"/>
-          </w:tcPr>
-          <w:p>
-            <w:r>
-              <w:rPr>
-                <w:rFonts w:ascii="Arial" w:hAnsi="Arial"/>
-                <w:b w:val="0"/>
-                <w:i w:val="0"/>
-                <w:color w:val="000000"/>
-                <w:sz w:val="18"/>
-              </w:rPr>
-            </w:r>
-          </w:p>
-        </w:tc>
       </w:tr>
       <w:tr>
         <w:tc>
           <w:tcPr>
-            <w:tcW w:type="dxa" w:w="2880"/>
+            <w:tcW w:type="dxa" w:w="4320"/>
           </w:tcPr>
           <w:p>
             <w:r>
@@ -3804,7 +2634,7 @@
         </w:tc>
         <w:tc>
           <w:tcPr>
-            <w:tcW w:type="dxa" w:w="2880"/>
+            <w:tcW w:type="dxa" w:w="4320"/>
           </w:tcPr>
           <w:p>
             <w:r>
@@ -3819,27 +2649,11 @@
             </w:r>
           </w:p>
         </w:tc>
-        <w:tc>
-          <w:tcPr>
-            <w:tcW w:type="dxa" w:w="2880"/>
-          </w:tcPr>
-          <w:p>
-            <w:r>
-              <w:rPr>
-                <w:rFonts w:ascii="Arial" w:hAnsi="Arial"/>
-                <w:b w:val="0"/>
-                <w:i w:val="0"/>
-                <w:color w:val="000000"/>
-                <w:sz w:val="18"/>
-              </w:rPr>
-            </w:r>
-          </w:p>
-        </w:tc>
       </w:tr>
       <w:tr>
         <w:tc>
           <w:tcPr>
-            <w:tcW w:type="dxa" w:w="2880"/>
+            <w:tcW w:type="dxa" w:w="4320"/>
           </w:tcPr>
           <w:p>
             <w:r>
@@ -3856,7 +2670,7 @@
         </w:tc>
         <w:tc>
           <w:tcPr>
-            <w:tcW w:type="dxa" w:w="2880"/>
+            <w:tcW w:type="dxa" w:w="4320"/>
           </w:tcPr>
           <w:p>
             <w:r>
@@ -3871,27 +2685,11 @@
             </w:r>
           </w:p>
         </w:tc>
-        <w:tc>
-          <w:tcPr>
-            <w:tcW w:type="dxa" w:w="2880"/>
-          </w:tcPr>
-          <w:p>
-            <w:r>
-              <w:rPr>
-                <w:rFonts w:ascii="Arial" w:hAnsi="Arial"/>
-                <w:b w:val="0"/>
-                <w:i w:val="0"/>
-                <w:color w:val="000000"/>
-                <w:sz w:val="18"/>
-              </w:rPr>
-            </w:r>
-          </w:p>
-        </w:tc>
       </w:tr>
       <w:tr>
         <w:tc>
           <w:tcPr>
-            <w:tcW w:type="dxa" w:w="2880"/>
+            <w:tcW w:type="dxa" w:w="4320"/>
           </w:tcPr>
           <w:p>
             <w:r>
@@ -3908,7 +2706,7 @@
         </w:tc>
         <w:tc>
           <w:tcPr>
-            <w:tcW w:type="dxa" w:w="2880"/>
+            <w:tcW w:type="dxa" w:w="4320"/>
           </w:tcPr>
           <w:p>
             <w:r>
@@ -3923,27 +2721,11 @@
             </w:r>
           </w:p>
         </w:tc>
-        <w:tc>
-          <w:tcPr>
-            <w:tcW w:type="dxa" w:w="2880"/>
-          </w:tcPr>
-          <w:p>
-            <w:r>
-              <w:rPr>
-                <w:rFonts w:ascii="Arial" w:hAnsi="Arial"/>
-                <w:b w:val="0"/>
-                <w:i w:val="0"/>
-                <w:color w:val="000000"/>
-                <w:sz w:val="18"/>
-              </w:rPr>
-            </w:r>
-          </w:p>
-        </w:tc>
       </w:tr>
       <w:tr>
         <w:tc>
           <w:tcPr>
-            <w:tcW w:type="dxa" w:w="2880"/>
+            <w:tcW w:type="dxa" w:w="4320"/>
           </w:tcPr>
           <w:p>
             <w:r>
@@ -3960,7 +2742,7 @@
         </w:tc>
         <w:tc>
           <w:tcPr>
-            <w:tcW w:type="dxa" w:w="2880"/>
+            <w:tcW w:type="dxa" w:w="4320"/>
           </w:tcPr>
           <w:p>
             <w:r>
@@ -3975,27 +2757,11 @@
             </w:r>
           </w:p>
         </w:tc>
-        <w:tc>
-          <w:tcPr>
-            <w:tcW w:type="dxa" w:w="2880"/>
-          </w:tcPr>
-          <w:p>
-            <w:r>
-              <w:rPr>
-                <w:rFonts w:ascii="Arial" w:hAnsi="Arial"/>
-                <w:b w:val="0"/>
-                <w:i w:val="0"/>
-                <w:color w:val="000000"/>
-                <w:sz w:val="18"/>
-              </w:rPr>
-            </w:r>
-          </w:p>
-        </w:tc>
       </w:tr>
       <w:tr>
         <w:tc>
           <w:tcPr>
-            <w:tcW w:type="dxa" w:w="2880"/>
+            <w:tcW w:type="dxa" w:w="4320"/>
           </w:tcPr>
           <w:p>
             <w:r>
@@ -4012,7 +2778,7 @@
         </w:tc>
         <w:tc>
           <w:tcPr>
-            <w:tcW w:type="dxa" w:w="2880"/>
+            <w:tcW w:type="dxa" w:w="4320"/>
           </w:tcPr>
           <w:p>
             <w:r>
@@ -4027,27 +2793,11 @@
             </w:r>
           </w:p>
         </w:tc>
-        <w:tc>
-          <w:tcPr>
-            <w:tcW w:type="dxa" w:w="2880"/>
-          </w:tcPr>
-          <w:p>
-            <w:r>
-              <w:rPr>
-                <w:rFonts w:ascii="Arial" w:hAnsi="Arial"/>
-                <w:b w:val="0"/>
-                <w:i w:val="0"/>
-                <w:color w:val="000000"/>
-                <w:sz w:val="18"/>
-              </w:rPr>
-            </w:r>
-          </w:p>
-        </w:tc>
       </w:tr>
       <w:tr>
         <w:tc>
           <w:tcPr>
-            <w:tcW w:type="dxa" w:w="2880"/>
+            <w:tcW w:type="dxa" w:w="4320"/>
           </w:tcPr>
           <w:p>
             <w:r>
@@ -4064,7 +2814,7 @@
         </w:tc>
         <w:tc>
           <w:tcPr>
-            <w:tcW w:type="dxa" w:w="2880"/>
+            <w:tcW w:type="dxa" w:w="4320"/>
           </w:tcPr>
           <w:p>
             <w:r>
@@ -4079,27 +2829,11 @@
             </w:r>
           </w:p>
         </w:tc>
-        <w:tc>
-          <w:tcPr>
-            <w:tcW w:type="dxa" w:w="2880"/>
-          </w:tcPr>
-          <w:p>
-            <w:r>
-              <w:rPr>
-                <w:rFonts w:ascii="Arial" w:hAnsi="Arial"/>
-                <w:b w:val="0"/>
-                <w:i w:val="0"/>
-                <w:color w:val="000000"/>
-                <w:sz w:val="18"/>
-              </w:rPr>
-            </w:r>
-          </w:p>
-        </w:tc>
       </w:tr>
       <w:tr>
         <w:tc>
           <w:tcPr>
-            <w:tcW w:type="dxa" w:w="2880"/>
+            <w:tcW w:type="dxa" w:w="4320"/>
           </w:tcPr>
           <w:p>
             <w:r>
@@ -4116,7 +2850,7 @@
         </w:tc>
         <w:tc>
           <w:tcPr>
-            <w:tcW w:type="dxa" w:w="2880"/>
+            <w:tcW w:type="dxa" w:w="4320"/>
           </w:tcPr>
           <w:p>
             <w:r>
@@ -4131,27 +2865,11 @@
             </w:r>
           </w:p>
         </w:tc>
-        <w:tc>
-          <w:tcPr>
-            <w:tcW w:type="dxa" w:w="2880"/>
-          </w:tcPr>
-          <w:p>
-            <w:r>
-              <w:rPr>
-                <w:rFonts w:ascii="Arial" w:hAnsi="Arial"/>
-                <w:b w:val="0"/>
-                <w:i w:val="0"/>
-                <w:color w:val="000000"/>
-                <w:sz w:val="18"/>
-              </w:rPr>
-            </w:r>
-          </w:p>
-        </w:tc>
       </w:tr>
       <w:tr>
         <w:tc>
           <w:tcPr>
-            <w:tcW w:type="dxa" w:w="2880"/>
+            <w:tcW w:type="dxa" w:w="4320"/>
           </w:tcPr>
           <w:p>
             <w:r>
@@ -4168,7 +2886,7 @@
         </w:tc>
         <w:tc>
           <w:tcPr>
-            <w:tcW w:type="dxa" w:w="2880"/>
+            <w:tcW w:type="dxa" w:w="4320"/>
           </w:tcPr>
           <w:p>
             <w:r>
@@ -4183,27 +2901,11 @@
             </w:r>
           </w:p>
         </w:tc>
-        <w:tc>
-          <w:tcPr>
-            <w:tcW w:type="dxa" w:w="2880"/>
-          </w:tcPr>
-          <w:p>
-            <w:r>
-              <w:rPr>
-                <w:rFonts w:ascii="Arial" w:hAnsi="Arial"/>
-                <w:b w:val="0"/>
-                <w:i w:val="0"/>
-                <w:color w:val="000000"/>
-                <w:sz w:val="18"/>
-              </w:rPr>
-            </w:r>
-          </w:p>
-        </w:tc>
       </w:tr>
       <w:tr>
         <w:tc>
           <w:tcPr>
-            <w:tcW w:type="dxa" w:w="2880"/>
+            <w:tcW w:type="dxa" w:w="4320"/>
           </w:tcPr>
           <w:p>
             <w:r>
@@ -4220,7 +2922,7 @@
         </w:tc>
         <w:tc>
           <w:tcPr>
-            <w:tcW w:type="dxa" w:w="2880"/>
+            <w:tcW w:type="dxa" w:w="4320"/>
           </w:tcPr>
           <w:p>
             <w:r>
@@ -4235,27 +2937,11 @@
             </w:r>
           </w:p>
         </w:tc>
-        <w:tc>
-          <w:tcPr>
-            <w:tcW w:type="dxa" w:w="2880"/>
-          </w:tcPr>
-          <w:p>
-            <w:r>
-              <w:rPr>
-                <w:rFonts w:ascii="Arial" w:hAnsi="Arial"/>
-                <w:b w:val="0"/>
-                <w:i w:val="0"/>
-                <w:color w:val="000000"/>
-                <w:sz w:val="18"/>
-              </w:rPr>
-            </w:r>
-          </w:p>
-        </w:tc>
       </w:tr>
       <w:tr>
         <w:tc>
           <w:tcPr>
-            <w:tcW w:type="dxa" w:w="2880"/>
+            <w:tcW w:type="dxa" w:w="4320"/>
           </w:tcPr>
           <w:p>
             <w:r>
@@ -4272,7 +2958,7 @@
         </w:tc>
         <w:tc>
           <w:tcPr>
-            <w:tcW w:type="dxa" w:w="2880"/>
+            <w:tcW w:type="dxa" w:w="4320"/>
           </w:tcPr>
           <w:p>
             <w:r>
@@ -4287,27 +2973,11 @@
             </w:r>
           </w:p>
         </w:tc>
-        <w:tc>
-          <w:tcPr>
-            <w:tcW w:type="dxa" w:w="2880"/>
-          </w:tcPr>
-          <w:p>
-            <w:r>
-              <w:rPr>
-                <w:rFonts w:ascii="Arial" w:hAnsi="Arial"/>
-                <w:b w:val="0"/>
-                <w:i w:val="0"/>
-                <w:color w:val="000000"/>
-                <w:sz w:val="18"/>
-              </w:rPr>
-            </w:r>
-          </w:p>
-        </w:tc>
       </w:tr>
       <w:tr>
         <w:tc>
           <w:tcPr>
-            <w:tcW w:type="dxa" w:w="2880"/>
+            <w:tcW w:type="dxa" w:w="4320"/>
           </w:tcPr>
           <w:p>
             <w:r>
@@ -4324,7 +2994,7 @@
         </w:tc>
         <w:tc>
           <w:tcPr>
-            <w:tcW w:type="dxa" w:w="2880"/>
+            <w:tcW w:type="dxa" w:w="4320"/>
           </w:tcPr>
           <w:p>
             <w:r>
@@ -4339,27 +3009,11 @@
             </w:r>
           </w:p>
         </w:tc>
-        <w:tc>
-          <w:tcPr>
-            <w:tcW w:type="dxa" w:w="2880"/>
-          </w:tcPr>
-          <w:p>
-            <w:r>
-              <w:rPr>
-                <w:rFonts w:ascii="Arial" w:hAnsi="Arial"/>
-                <w:b w:val="0"/>
-                <w:i w:val="0"/>
-                <w:color w:val="000000"/>
-                <w:sz w:val="18"/>
-              </w:rPr>
-            </w:r>
-          </w:p>
-        </w:tc>
       </w:tr>
       <w:tr>
         <w:tc>
           <w:tcPr>
-            <w:tcW w:type="dxa" w:w="2880"/>
+            <w:tcW w:type="dxa" w:w="4320"/>
           </w:tcPr>
           <w:p>
             <w:r>
@@ -4376,7 +3030,7 @@
         </w:tc>
         <w:tc>
           <w:tcPr>
-            <w:tcW w:type="dxa" w:w="2880"/>
+            <w:tcW w:type="dxa" w:w="4320"/>
           </w:tcPr>
           <w:p>
             <w:r>
@@ -4391,27 +3045,11 @@
             </w:r>
           </w:p>
         </w:tc>
-        <w:tc>
-          <w:tcPr>
-            <w:tcW w:type="dxa" w:w="2880"/>
-          </w:tcPr>
-          <w:p>
-            <w:r>
-              <w:rPr>
-                <w:rFonts w:ascii="Arial" w:hAnsi="Arial"/>
-                <w:b w:val="0"/>
-                <w:i w:val="0"/>
-                <w:color w:val="000000"/>
-                <w:sz w:val="18"/>
-              </w:rPr>
-            </w:r>
-          </w:p>
-        </w:tc>
       </w:tr>
       <w:tr>
         <w:tc>
           <w:tcPr>
-            <w:tcW w:type="dxa" w:w="2880"/>
+            <w:tcW w:type="dxa" w:w="4320"/>
           </w:tcPr>
           <w:p>
             <w:r>
@@ -4428,7 +3066,7 @@
         </w:tc>
         <w:tc>
           <w:tcPr>
-            <w:tcW w:type="dxa" w:w="2880"/>
+            <w:tcW w:type="dxa" w:w="4320"/>
           </w:tcPr>
           <w:p>
             <w:r>
@@ -4443,27 +3081,11 @@
             </w:r>
           </w:p>
         </w:tc>
-        <w:tc>
-          <w:tcPr>
-            <w:tcW w:type="dxa" w:w="2880"/>
-          </w:tcPr>
-          <w:p>
-            <w:r>
-              <w:rPr>
-                <w:rFonts w:ascii="Arial" w:hAnsi="Arial"/>
-                <w:b w:val="0"/>
-                <w:i w:val="0"/>
-                <w:color w:val="000000"/>
-                <w:sz w:val="18"/>
-              </w:rPr>
-            </w:r>
-          </w:p>
-        </w:tc>
       </w:tr>
       <w:tr>
         <w:tc>
           <w:tcPr>
-            <w:tcW w:type="dxa" w:w="2880"/>
+            <w:tcW w:type="dxa" w:w="4320"/>
           </w:tcPr>
           <w:p>
             <w:r>
@@ -4480,7 +3102,7 @@
         </w:tc>
         <w:tc>
           <w:tcPr>
-            <w:tcW w:type="dxa" w:w="2880"/>
+            <w:tcW w:type="dxa" w:w="4320"/>
           </w:tcPr>
           <w:p>
             <w:r>
@@ -4495,27 +3117,11 @@
             </w:r>
           </w:p>
         </w:tc>
-        <w:tc>
-          <w:tcPr>
-            <w:tcW w:type="dxa" w:w="2880"/>
-          </w:tcPr>
-          <w:p>
-            <w:r>
-              <w:rPr>
-                <w:rFonts w:ascii="Arial" w:hAnsi="Arial"/>
-                <w:b w:val="0"/>
-                <w:i w:val="0"/>
-                <w:color w:val="000000"/>
-                <w:sz w:val="18"/>
-              </w:rPr>
-            </w:r>
-          </w:p>
-        </w:tc>
       </w:tr>
       <w:tr>
         <w:tc>
           <w:tcPr>
-            <w:tcW w:type="dxa" w:w="2880"/>
+            <w:tcW w:type="dxa" w:w="4320"/>
           </w:tcPr>
           <w:p>
             <w:r>
@@ -4532,7 +3138,7 @@
         </w:tc>
         <w:tc>
           <w:tcPr>
-            <w:tcW w:type="dxa" w:w="2880"/>
+            <w:tcW w:type="dxa" w:w="4320"/>
           </w:tcPr>
           <w:p>
             <w:r>
@@ -4547,27 +3153,11 @@
             </w:r>
           </w:p>
         </w:tc>
-        <w:tc>
-          <w:tcPr>
-            <w:tcW w:type="dxa" w:w="2880"/>
-          </w:tcPr>
-          <w:p>
-            <w:r>
-              <w:rPr>
-                <w:rFonts w:ascii="Arial" w:hAnsi="Arial"/>
-                <w:b w:val="0"/>
-                <w:i w:val="0"/>
-                <w:color w:val="000000"/>
-                <w:sz w:val="18"/>
-              </w:rPr>
-            </w:r>
-          </w:p>
-        </w:tc>
       </w:tr>
       <w:tr>
         <w:tc>
           <w:tcPr>
-            <w:tcW w:type="dxa" w:w="2880"/>
+            <w:tcW w:type="dxa" w:w="4320"/>
           </w:tcPr>
           <w:p>
             <w:r>
@@ -4584,7 +3174,7 @@
         </w:tc>
         <w:tc>
           <w:tcPr>
-            <w:tcW w:type="dxa" w:w="2880"/>
+            <w:tcW w:type="dxa" w:w="4320"/>
           </w:tcPr>
           <w:p>
             <w:r>
@@ -4599,27 +3189,11 @@
             </w:r>
           </w:p>
         </w:tc>
-        <w:tc>
-          <w:tcPr>
-            <w:tcW w:type="dxa" w:w="2880"/>
-          </w:tcPr>
-          <w:p>
-            <w:r>
-              <w:rPr>
-                <w:rFonts w:ascii="Arial" w:hAnsi="Arial"/>
-                <w:b w:val="0"/>
-                <w:i w:val="0"/>
-                <w:color w:val="000000"/>
-                <w:sz w:val="18"/>
-              </w:rPr>
-            </w:r>
-          </w:p>
-        </w:tc>
       </w:tr>
       <w:tr>
         <w:tc>
           <w:tcPr>
-            <w:tcW w:type="dxa" w:w="2880"/>
+            <w:tcW w:type="dxa" w:w="4320"/>
           </w:tcPr>
           <w:p>
             <w:r>
@@ -4636,7 +3210,7 @@
         </w:tc>
         <w:tc>
           <w:tcPr>
-            <w:tcW w:type="dxa" w:w="2880"/>
+            <w:tcW w:type="dxa" w:w="4320"/>
           </w:tcPr>
           <w:p>
             <w:r>
@@ -4651,27 +3225,11 @@
             </w:r>
           </w:p>
         </w:tc>
-        <w:tc>
-          <w:tcPr>
-            <w:tcW w:type="dxa" w:w="2880"/>
-          </w:tcPr>
-          <w:p>
-            <w:r>
-              <w:rPr>
-                <w:rFonts w:ascii="Arial" w:hAnsi="Arial"/>
-                <w:b w:val="0"/>
-                <w:i w:val="0"/>
-                <w:color w:val="000000"/>
-                <w:sz w:val="18"/>
-              </w:rPr>
-            </w:r>
-          </w:p>
-        </w:tc>
       </w:tr>
       <w:tr>
         <w:tc>
           <w:tcPr>
-            <w:tcW w:type="dxa" w:w="2880"/>
+            <w:tcW w:type="dxa" w:w="4320"/>
           </w:tcPr>
           <w:p>
             <w:r>
@@ -4688,7 +3246,7 @@
         </w:tc>
         <w:tc>
           <w:tcPr>
-            <w:tcW w:type="dxa" w:w="2880"/>
+            <w:tcW w:type="dxa" w:w="4320"/>
           </w:tcPr>
           <w:p>
             <w:r>
@@ -4703,27 +3261,11 @@
             </w:r>
           </w:p>
         </w:tc>
-        <w:tc>
-          <w:tcPr>
-            <w:tcW w:type="dxa" w:w="2880"/>
-          </w:tcPr>
-          <w:p>
-            <w:r>
-              <w:rPr>
-                <w:rFonts w:ascii="Arial" w:hAnsi="Arial"/>
-                <w:b w:val="0"/>
-                <w:i w:val="0"/>
-                <w:color w:val="000000"/>
-                <w:sz w:val="18"/>
-              </w:rPr>
-            </w:r>
-          </w:p>
-        </w:tc>
       </w:tr>
       <w:tr>
         <w:tc>
           <w:tcPr>
-            <w:tcW w:type="dxa" w:w="2880"/>
+            <w:tcW w:type="dxa" w:w="4320"/>
           </w:tcPr>
           <w:p>
             <w:r>
@@ -4740,7 +3282,7 @@
         </w:tc>
         <w:tc>
           <w:tcPr>
-            <w:tcW w:type="dxa" w:w="2880"/>
+            <w:tcW w:type="dxa" w:w="4320"/>
           </w:tcPr>
           <w:p>
             <w:r>
@@ -4755,27 +3297,11 @@
             </w:r>
           </w:p>
         </w:tc>
-        <w:tc>
-          <w:tcPr>
-            <w:tcW w:type="dxa" w:w="2880"/>
-          </w:tcPr>
-          <w:p>
-            <w:r>
-              <w:rPr>
-                <w:rFonts w:ascii="Arial" w:hAnsi="Arial"/>
-                <w:b w:val="0"/>
-                <w:i w:val="0"/>
-                <w:color w:val="000000"/>
-                <w:sz w:val="18"/>
-              </w:rPr>
-            </w:r>
-          </w:p>
-        </w:tc>
       </w:tr>
       <w:tr>
         <w:tc>
           <w:tcPr>
-            <w:tcW w:type="dxa" w:w="2880"/>
+            <w:tcW w:type="dxa" w:w="4320"/>
           </w:tcPr>
           <w:p>
             <w:r>
@@ -4792,7 +3318,7 @@
         </w:tc>
         <w:tc>
           <w:tcPr>
-            <w:tcW w:type="dxa" w:w="2880"/>
+            <w:tcW w:type="dxa" w:w="4320"/>
           </w:tcPr>
           <w:p>
             <w:r>
@@ -4807,27 +3333,11 @@
             </w:r>
           </w:p>
         </w:tc>
-        <w:tc>
-          <w:tcPr>
-            <w:tcW w:type="dxa" w:w="2880"/>
-          </w:tcPr>
-          <w:p>
-            <w:r>
-              <w:rPr>
-                <w:rFonts w:ascii="Arial" w:hAnsi="Arial"/>
-                <w:b w:val="0"/>
-                <w:i w:val="0"/>
-                <w:color w:val="000000"/>
-                <w:sz w:val="18"/>
-              </w:rPr>
-            </w:r>
-          </w:p>
-        </w:tc>
       </w:tr>
       <w:tr>
         <w:tc>
           <w:tcPr>
-            <w:tcW w:type="dxa" w:w="2880"/>
+            <w:tcW w:type="dxa" w:w="4320"/>
           </w:tcPr>
           <w:p>
             <w:r>
@@ -4844,7 +3354,7 @@
         </w:tc>
         <w:tc>
           <w:tcPr>
-            <w:tcW w:type="dxa" w:w="2880"/>
+            <w:tcW w:type="dxa" w:w="4320"/>
           </w:tcPr>
           <w:p>
             <w:r>
@@ -4859,27 +3369,11 @@
             </w:r>
           </w:p>
         </w:tc>
-        <w:tc>
-          <w:tcPr>
-            <w:tcW w:type="dxa" w:w="2880"/>
-          </w:tcPr>
-          <w:p>
-            <w:r>
-              <w:rPr>
-                <w:rFonts w:ascii="Arial" w:hAnsi="Arial"/>
-                <w:b w:val="0"/>
-                <w:i w:val="0"/>
-                <w:color w:val="000000"/>
-                <w:sz w:val="18"/>
-              </w:rPr>
-            </w:r>
-          </w:p>
-        </w:tc>
       </w:tr>
       <w:tr>
         <w:tc>
           <w:tcPr>
-            <w:tcW w:type="dxa" w:w="2880"/>
+            <w:tcW w:type="dxa" w:w="4320"/>
           </w:tcPr>
           <w:p>
             <w:r>
@@ -4896,7 +3390,7 @@
         </w:tc>
         <w:tc>
           <w:tcPr>
-            <w:tcW w:type="dxa" w:w="2880"/>
+            <w:tcW w:type="dxa" w:w="4320"/>
           </w:tcPr>
           <w:p>
             <w:r>
@@ -4911,27 +3405,11 @@
             </w:r>
           </w:p>
         </w:tc>
-        <w:tc>
-          <w:tcPr>
-            <w:tcW w:type="dxa" w:w="2880"/>
-          </w:tcPr>
-          <w:p>
-            <w:r>
-              <w:rPr>
-                <w:rFonts w:ascii="Arial" w:hAnsi="Arial"/>
-                <w:b w:val="0"/>
-                <w:i w:val="0"/>
-                <w:color w:val="000000"/>
-                <w:sz w:val="18"/>
-              </w:rPr>
-            </w:r>
-          </w:p>
-        </w:tc>
       </w:tr>
       <w:tr>
         <w:tc>
           <w:tcPr>
-            <w:tcW w:type="dxa" w:w="2880"/>
+            <w:tcW w:type="dxa" w:w="4320"/>
           </w:tcPr>
           <w:p>
             <w:r>
@@ -4948,7 +3426,7 @@
         </w:tc>
         <w:tc>
           <w:tcPr>
-            <w:tcW w:type="dxa" w:w="2880"/>
+            <w:tcW w:type="dxa" w:w="4320"/>
           </w:tcPr>
           <w:p>
             <w:r>
@@ -4963,27 +3441,11 @@
             </w:r>
           </w:p>
         </w:tc>
-        <w:tc>
-          <w:tcPr>
-            <w:tcW w:type="dxa" w:w="2880"/>
-          </w:tcPr>
-          <w:p>
-            <w:r>
-              <w:rPr>
-                <w:rFonts w:ascii="Arial" w:hAnsi="Arial"/>
-                <w:b w:val="0"/>
-                <w:i w:val="0"/>
-                <w:color w:val="000000"/>
-                <w:sz w:val="18"/>
-              </w:rPr>
-            </w:r>
-          </w:p>
-        </w:tc>
       </w:tr>
       <w:tr>
         <w:tc>
           <w:tcPr>
-            <w:tcW w:type="dxa" w:w="2880"/>
+            <w:tcW w:type="dxa" w:w="4320"/>
           </w:tcPr>
           <w:p>
             <w:r>
@@ -5000,7 +3462,7 @@
         </w:tc>
         <w:tc>
           <w:tcPr>
-            <w:tcW w:type="dxa" w:w="2880"/>
+            <w:tcW w:type="dxa" w:w="4320"/>
           </w:tcPr>
           <w:p>
             <w:r>
@@ -5015,27 +3477,11 @@
             </w:r>
           </w:p>
         </w:tc>
-        <w:tc>
-          <w:tcPr>
-            <w:tcW w:type="dxa" w:w="2880"/>
-          </w:tcPr>
-          <w:p>
-            <w:r>
-              <w:rPr>
-                <w:rFonts w:ascii="Arial" w:hAnsi="Arial"/>
-                <w:b w:val="0"/>
-                <w:i w:val="0"/>
-                <w:color w:val="000000"/>
-                <w:sz w:val="18"/>
-              </w:rPr>
-            </w:r>
-          </w:p>
-        </w:tc>
       </w:tr>
       <w:tr>
         <w:tc>
           <w:tcPr>
-            <w:tcW w:type="dxa" w:w="2880"/>
+            <w:tcW w:type="dxa" w:w="4320"/>
           </w:tcPr>
           <w:p>
             <w:r>
@@ -5052,7 +3498,7 @@
         </w:tc>
         <w:tc>
           <w:tcPr>
-            <w:tcW w:type="dxa" w:w="2880"/>
+            <w:tcW w:type="dxa" w:w="4320"/>
           </w:tcPr>
           <w:p>
             <w:r>
@@ -5067,27 +3513,11 @@
             </w:r>
           </w:p>
         </w:tc>
-        <w:tc>
-          <w:tcPr>
-            <w:tcW w:type="dxa" w:w="2880"/>
-          </w:tcPr>
-          <w:p>
-            <w:r>
-              <w:rPr>
-                <w:rFonts w:ascii="Arial" w:hAnsi="Arial"/>
-                <w:b w:val="0"/>
-                <w:i w:val="0"/>
-                <w:color w:val="000000"/>
-                <w:sz w:val="18"/>
-              </w:rPr>
-            </w:r>
-          </w:p>
-        </w:tc>
       </w:tr>
       <w:tr>
         <w:tc>
           <w:tcPr>
-            <w:tcW w:type="dxa" w:w="2880"/>
+            <w:tcW w:type="dxa" w:w="4320"/>
           </w:tcPr>
           <w:p>
             <w:r>
@@ -5104,7 +3534,7 @@
         </w:tc>
         <w:tc>
           <w:tcPr>
-            <w:tcW w:type="dxa" w:w="2880"/>
+            <w:tcW w:type="dxa" w:w="4320"/>
           </w:tcPr>
           <w:p>
             <w:r>
@@ -5119,27 +3549,11 @@
             </w:r>
           </w:p>
         </w:tc>
-        <w:tc>
-          <w:tcPr>
-            <w:tcW w:type="dxa" w:w="2880"/>
-          </w:tcPr>
-          <w:p>
-            <w:r>
-              <w:rPr>
-                <w:rFonts w:ascii="Arial" w:hAnsi="Arial"/>
-                <w:b w:val="0"/>
-                <w:i w:val="0"/>
-                <w:color w:val="000000"/>
-                <w:sz w:val="18"/>
-              </w:rPr>
-            </w:r>
-          </w:p>
-        </w:tc>
       </w:tr>
       <w:tr>
         <w:tc>
           <w:tcPr>
-            <w:tcW w:type="dxa" w:w="2880"/>
+            <w:tcW w:type="dxa" w:w="4320"/>
           </w:tcPr>
           <w:p>
             <w:r>
@@ -5156,7 +3570,7 @@
         </w:tc>
         <w:tc>
           <w:tcPr>
-            <w:tcW w:type="dxa" w:w="2880"/>
+            <w:tcW w:type="dxa" w:w="4320"/>
           </w:tcPr>
           <w:p>
             <w:r>
@@ -5171,27 +3585,11 @@
             </w:r>
           </w:p>
         </w:tc>
-        <w:tc>
-          <w:tcPr>
-            <w:tcW w:type="dxa" w:w="2880"/>
-          </w:tcPr>
-          <w:p>
-            <w:r>
-              <w:rPr>
-                <w:rFonts w:ascii="Arial" w:hAnsi="Arial"/>
-                <w:b w:val="0"/>
-                <w:i w:val="0"/>
-                <w:color w:val="000000"/>
-                <w:sz w:val="18"/>
-              </w:rPr>
-            </w:r>
-          </w:p>
-        </w:tc>
       </w:tr>
       <w:tr>
         <w:tc>
           <w:tcPr>
-            <w:tcW w:type="dxa" w:w="2880"/>
+            <w:tcW w:type="dxa" w:w="4320"/>
           </w:tcPr>
           <w:p>
             <w:r>
@@ -5208,7 +3606,7 @@
         </w:tc>
         <w:tc>
           <w:tcPr>
-            <w:tcW w:type="dxa" w:w="2880"/>
+            <w:tcW w:type="dxa" w:w="4320"/>
           </w:tcPr>
           <w:p>
             <w:r>
@@ -5223,27 +3621,11 @@
             </w:r>
           </w:p>
         </w:tc>
-        <w:tc>
-          <w:tcPr>
-            <w:tcW w:type="dxa" w:w="2880"/>
-          </w:tcPr>
-          <w:p>
-            <w:r>
-              <w:rPr>
-                <w:rFonts w:ascii="Arial" w:hAnsi="Arial"/>
-                <w:b w:val="0"/>
-                <w:i w:val="0"/>
-                <w:color w:val="000000"/>
-                <w:sz w:val="18"/>
-              </w:rPr>
-            </w:r>
-          </w:p>
-        </w:tc>
       </w:tr>
       <w:tr>
         <w:tc>
           <w:tcPr>
-            <w:tcW w:type="dxa" w:w="2880"/>
+            <w:tcW w:type="dxa" w:w="4320"/>
           </w:tcPr>
           <w:p>
             <w:r>
@@ -5260,7 +3642,7 @@
         </w:tc>
         <w:tc>
           <w:tcPr>
-            <w:tcW w:type="dxa" w:w="2880"/>
+            <w:tcW w:type="dxa" w:w="4320"/>
           </w:tcPr>
           <w:p>
             <w:r>
@@ -5275,27 +3657,11 @@
             </w:r>
           </w:p>
         </w:tc>
-        <w:tc>
-          <w:tcPr>
-            <w:tcW w:type="dxa" w:w="2880"/>
-          </w:tcPr>
-          <w:p>
-            <w:r>
-              <w:rPr>
-                <w:rFonts w:ascii="Arial" w:hAnsi="Arial"/>
-                <w:b w:val="0"/>
-                <w:i w:val="0"/>
-                <w:color w:val="000000"/>
-                <w:sz w:val="18"/>
-              </w:rPr>
-            </w:r>
-          </w:p>
-        </w:tc>
       </w:tr>
       <w:tr>
         <w:tc>
           <w:tcPr>
-            <w:tcW w:type="dxa" w:w="2880"/>
+            <w:tcW w:type="dxa" w:w="4320"/>
           </w:tcPr>
           <w:p>
             <w:r>
@@ -5312,7 +3678,7 @@
         </w:tc>
         <w:tc>
           <w:tcPr>
-            <w:tcW w:type="dxa" w:w="2880"/>
+            <w:tcW w:type="dxa" w:w="4320"/>
           </w:tcPr>
           <w:p>
             <w:r>
@@ -5327,27 +3693,11 @@
             </w:r>
           </w:p>
         </w:tc>
-        <w:tc>
-          <w:tcPr>
-            <w:tcW w:type="dxa" w:w="2880"/>
-          </w:tcPr>
-          <w:p>
-            <w:r>
-              <w:rPr>
-                <w:rFonts w:ascii="Arial" w:hAnsi="Arial"/>
-                <w:b w:val="0"/>
-                <w:i w:val="0"/>
-                <w:color w:val="000000"/>
-                <w:sz w:val="18"/>
-              </w:rPr>
-            </w:r>
-          </w:p>
-        </w:tc>
       </w:tr>
       <w:tr>
         <w:tc>
           <w:tcPr>
-            <w:tcW w:type="dxa" w:w="2880"/>
+            <w:tcW w:type="dxa" w:w="4320"/>
           </w:tcPr>
           <w:p>
             <w:r>
@@ -5364,7 +3714,7 @@
         </w:tc>
         <w:tc>
           <w:tcPr>
-            <w:tcW w:type="dxa" w:w="2880"/>
+            <w:tcW w:type="dxa" w:w="4320"/>
           </w:tcPr>
           <w:p>
             <w:r>
@@ -5379,27 +3729,11 @@
             </w:r>
           </w:p>
         </w:tc>
-        <w:tc>
-          <w:tcPr>
-            <w:tcW w:type="dxa" w:w="2880"/>
-          </w:tcPr>
-          <w:p>
-            <w:r>
-              <w:rPr>
-                <w:rFonts w:ascii="Arial" w:hAnsi="Arial"/>
-                <w:b w:val="0"/>
-                <w:i w:val="0"/>
-                <w:color w:val="000000"/>
-                <w:sz w:val="18"/>
-              </w:rPr>
-            </w:r>
-          </w:p>
-        </w:tc>
       </w:tr>
       <w:tr>
         <w:tc>
           <w:tcPr>
-            <w:tcW w:type="dxa" w:w="2880"/>
+            <w:tcW w:type="dxa" w:w="4320"/>
           </w:tcPr>
           <w:p>
             <w:r>
@@ -5416,7 +3750,7 @@
         </w:tc>
         <w:tc>
           <w:tcPr>
-            <w:tcW w:type="dxa" w:w="2880"/>
+            <w:tcW w:type="dxa" w:w="4320"/>
           </w:tcPr>
           <w:p>
             <w:r>
@@ -5431,27 +3765,11 @@
             </w:r>
           </w:p>
         </w:tc>
-        <w:tc>
-          <w:tcPr>
-            <w:tcW w:type="dxa" w:w="2880"/>
-          </w:tcPr>
-          <w:p>
-            <w:r>
-              <w:rPr>
-                <w:rFonts w:ascii="Arial" w:hAnsi="Arial"/>
-                <w:b w:val="0"/>
-                <w:i w:val="0"/>
-                <w:color w:val="000000"/>
-                <w:sz w:val="18"/>
-              </w:rPr>
-            </w:r>
-          </w:p>
-        </w:tc>
       </w:tr>
       <w:tr>
         <w:tc>
           <w:tcPr>
-            <w:tcW w:type="dxa" w:w="2880"/>
+            <w:tcW w:type="dxa" w:w="4320"/>
           </w:tcPr>
           <w:p>
             <w:r>
@@ -5468,7 +3786,7 @@
         </w:tc>
         <w:tc>
           <w:tcPr>
-            <w:tcW w:type="dxa" w:w="2880"/>
+            <w:tcW w:type="dxa" w:w="4320"/>
           </w:tcPr>
           <w:p>
             <w:r>
@@ -5483,27 +3801,11 @@
             </w:r>
           </w:p>
         </w:tc>
-        <w:tc>
-          <w:tcPr>
-            <w:tcW w:type="dxa" w:w="2880"/>
-          </w:tcPr>
-          <w:p>
-            <w:r>
-              <w:rPr>
-                <w:rFonts w:ascii="Arial" w:hAnsi="Arial"/>
-                <w:b w:val="0"/>
-                <w:i w:val="0"/>
-                <w:color w:val="000000"/>
-                <w:sz w:val="18"/>
-              </w:rPr>
-            </w:r>
-          </w:p>
-        </w:tc>
       </w:tr>
       <w:tr>
         <w:tc>
           <w:tcPr>
-            <w:tcW w:type="dxa" w:w="2880"/>
+            <w:tcW w:type="dxa" w:w="4320"/>
           </w:tcPr>
           <w:p>
             <w:r>
@@ -5520,7 +3822,7 @@
         </w:tc>
         <w:tc>
           <w:tcPr>
-            <w:tcW w:type="dxa" w:w="2880"/>
+            <w:tcW w:type="dxa" w:w="4320"/>
           </w:tcPr>
           <w:p>
             <w:r>
@@ -5535,27 +3837,11 @@
             </w:r>
           </w:p>
         </w:tc>
-        <w:tc>
-          <w:tcPr>
-            <w:tcW w:type="dxa" w:w="2880"/>
-          </w:tcPr>
-          <w:p>
-            <w:r>
-              <w:rPr>
-                <w:rFonts w:ascii="Arial" w:hAnsi="Arial"/>
-                <w:b w:val="0"/>
-                <w:i w:val="0"/>
-                <w:color w:val="000000"/>
-                <w:sz w:val="18"/>
-              </w:rPr>
-            </w:r>
-          </w:p>
-        </w:tc>
       </w:tr>
       <w:tr>
         <w:tc>
           <w:tcPr>
-            <w:tcW w:type="dxa" w:w="2880"/>
+            <w:tcW w:type="dxa" w:w="4320"/>
           </w:tcPr>
           <w:p>
             <w:r>
@@ -5572,7 +3858,7 @@
         </w:tc>
         <w:tc>
           <w:tcPr>
-            <w:tcW w:type="dxa" w:w="2880"/>
+            <w:tcW w:type="dxa" w:w="4320"/>
           </w:tcPr>
           <w:p>
             <w:r>
@@ -5587,27 +3873,11 @@
             </w:r>
           </w:p>
         </w:tc>
-        <w:tc>
-          <w:tcPr>
-            <w:tcW w:type="dxa" w:w="2880"/>
-          </w:tcPr>
-          <w:p>
-            <w:r>
-              <w:rPr>
-                <w:rFonts w:ascii="Arial" w:hAnsi="Arial"/>
-                <w:b w:val="0"/>
-                <w:i w:val="0"/>
-                <w:color w:val="000000"/>
-                <w:sz w:val="18"/>
-              </w:rPr>
-            </w:r>
-          </w:p>
-        </w:tc>
       </w:tr>
       <w:tr>
         <w:tc>
           <w:tcPr>
-            <w:tcW w:type="dxa" w:w="2880"/>
+            <w:tcW w:type="dxa" w:w="4320"/>
           </w:tcPr>
           <w:p>
             <w:r>
@@ -5624,7 +3894,7 @@
         </w:tc>
         <w:tc>
           <w:tcPr>
-            <w:tcW w:type="dxa" w:w="2880"/>
+            <w:tcW w:type="dxa" w:w="4320"/>
           </w:tcPr>
           <w:p>
             <w:r>
@@ -5639,27 +3909,11 @@
             </w:r>
           </w:p>
         </w:tc>
-        <w:tc>
-          <w:tcPr>
-            <w:tcW w:type="dxa" w:w="2880"/>
-          </w:tcPr>
-          <w:p>
-            <w:r>
-              <w:rPr>
-                <w:rFonts w:ascii="Arial" w:hAnsi="Arial"/>
-                <w:b w:val="0"/>
-                <w:i w:val="0"/>
-                <w:color w:val="000000"/>
-                <w:sz w:val="18"/>
-              </w:rPr>
-            </w:r>
-          </w:p>
-        </w:tc>
       </w:tr>
       <w:tr>
         <w:tc>
           <w:tcPr>
-            <w:tcW w:type="dxa" w:w="2880"/>
+            <w:tcW w:type="dxa" w:w="4320"/>
           </w:tcPr>
           <w:p>
             <w:r>
@@ -5676,7 +3930,7 @@
         </w:tc>
         <w:tc>
           <w:tcPr>
-            <w:tcW w:type="dxa" w:w="2880"/>
+            <w:tcW w:type="dxa" w:w="4320"/>
           </w:tcPr>
           <w:p>
             <w:r>
@@ -5691,27 +3945,11 @@
             </w:r>
           </w:p>
         </w:tc>
-        <w:tc>
-          <w:tcPr>
-            <w:tcW w:type="dxa" w:w="2880"/>
-          </w:tcPr>
-          <w:p>
-            <w:r>
-              <w:rPr>
-                <w:rFonts w:ascii="Arial" w:hAnsi="Arial"/>
-                <w:b w:val="0"/>
-                <w:i w:val="0"/>
-                <w:color w:val="000000"/>
-                <w:sz w:val="18"/>
-              </w:rPr>
-            </w:r>
-          </w:p>
-        </w:tc>
       </w:tr>
       <w:tr>
         <w:tc>
           <w:tcPr>
-            <w:tcW w:type="dxa" w:w="2880"/>
+            <w:tcW w:type="dxa" w:w="4320"/>
           </w:tcPr>
           <w:p>
             <w:r>
@@ -5728,7 +3966,7 @@
         </w:tc>
         <w:tc>
           <w:tcPr>
-            <w:tcW w:type="dxa" w:w="2880"/>
+            <w:tcW w:type="dxa" w:w="4320"/>
           </w:tcPr>
           <w:p>
             <w:r>
@@ -5743,27 +3981,11 @@
             </w:r>
           </w:p>
         </w:tc>
-        <w:tc>
-          <w:tcPr>
-            <w:tcW w:type="dxa" w:w="2880"/>
-          </w:tcPr>
-          <w:p>
-            <w:r>
-              <w:rPr>
-                <w:rFonts w:ascii="Arial" w:hAnsi="Arial"/>
-                <w:b w:val="0"/>
-                <w:i w:val="0"/>
-                <w:color w:val="000000"/>
-                <w:sz w:val="18"/>
-              </w:rPr>
-            </w:r>
-          </w:p>
-        </w:tc>
       </w:tr>
       <w:tr>
         <w:tc>
           <w:tcPr>
-            <w:tcW w:type="dxa" w:w="2880"/>
+            <w:tcW w:type="dxa" w:w="4320"/>
           </w:tcPr>
           <w:p>
             <w:r>
@@ -5780,7 +4002,7 @@
         </w:tc>
         <w:tc>
           <w:tcPr>
-            <w:tcW w:type="dxa" w:w="2880"/>
+            <w:tcW w:type="dxa" w:w="4320"/>
           </w:tcPr>
           <w:p>
             <w:r>
@@ -5795,27 +4017,11 @@
             </w:r>
           </w:p>
         </w:tc>
-        <w:tc>
-          <w:tcPr>
-            <w:tcW w:type="dxa" w:w="2880"/>
-          </w:tcPr>
-          <w:p>
-            <w:r>
-              <w:rPr>
-                <w:rFonts w:ascii="Arial" w:hAnsi="Arial"/>
-                <w:b w:val="0"/>
-                <w:i w:val="0"/>
-                <w:color w:val="000000"/>
-                <w:sz w:val="18"/>
-              </w:rPr>
-            </w:r>
-          </w:p>
-        </w:tc>
       </w:tr>
       <w:tr>
         <w:tc>
           <w:tcPr>
-            <w:tcW w:type="dxa" w:w="2880"/>
+            <w:tcW w:type="dxa" w:w="4320"/>
           </w:tcPr>
           <w:p>
             <w:r>
@@ -5832,7 +4038,7 @@
         </w:tc>
         <w:tc>
           <w:tcPr>
-            <w:tcW w:type="dxa" w:w="2880"/>
+            <w:tcW w:type="dxa" w:w="4320"/>
           </w:tcPr>
           <w:p>
             <w:r>
@@ -5847,27 +4053,11 @@
             </w:r>
           </w:p>
         </w:tc>
-        <w:tc>
-          <w:tcPr>
-            <w:tcW w:type="dxa" w:w="2880"/>
-          </w:tcPr>
-          <w:p>
-            <w:r>
-              <w:rPr>
-                <w:rFonts w:ascii="Arial" w:hAnsi="Arial"/>
-                <w:b w:val="0"/>
-                <w:i w:val="0"/>
-                <w:color w:val="000000"/>
-                <w:sz w:val="18"/>
-              </w:rPr>
-            </w:r>
-          </w:p>
-        </w:tc>
       </w:tr>
       <w:tr>
         <w:tc>
           <w:tcPr>
-            <w:tcW w:type="dxa" w:w="2880"/>
+            <w:tcW w:type="dxa" w:w="4320"/>
           </w:tcPr>
           <w:p>
             <w:r>
@@ -5884,7 +4074,7 @@
         </w:tc>
         <w:tc>
           <w:tcPr>
-            <w:tcW w:type="dxa" w:w="2880"/>
+            <w:tcW w:type="dxa" w:w="4320"/>
           </w:tcPr>
           <w:p>
             <w:r>
@@ -5899,27 +4089,11 @@
             </w:r>
           </w:p>
         </w:tc>
-        <w:tc>
-          <w:tcPr>
-            <w:tcW w:type="dxa" w:w="2880"/>
-          </w:tcPr>
-          <w:p>
-            <w:r>
-              <w:rPr>
-                <w:rFonts w:ascii="Arial" w:hAnsi="Arial"/>
-                <w:b w:val="0"/>
-                <w:i w:val="0"/>
-                <w:color w:val="000000"/>
-                <w:sz w:val="18"/>
-              </w:rPr>
-            </w:r>
-          </w:p>
-        </w:tc>
       </w:tr>
       <w:tr>
         <w:tc>
           <w:tcPr>
-            <w:tcW w:type="dxa" w:w="2880"/>
+            <w:tcW w:type="dxa" w:w="4320"/>
           </w:tcPr>
           <w:p>
             <w:r>
@@ -5936,7 +4110,7 @@
         </w:tc>
         <w:tc>
           <w:tcPr>
-            <w:tcW w:type="dxa" w:w="2880"/>
+            <w:tcW w:type="dxa" w:w="4320"/>
           </w:tcPr>
           <w:p>
             <w:r>
@@ -5951,27 +4125,11 @@
             </w:r>
           </w:p>
         </w:tc>
-        <w:tc>
-          <w:tcPr>
-            <w:tcW w:type="dxa" w:w="2880"/>
-          </w:tcPr>
-          <w:p>
-            <w:r>
-              <w:rPr>
-                <w:rFonts w:ascii="Arial" w:hAnsi="Arial"/>
-                <w:b w:val="0"/>
-                <w:i w:val="0"/>
-                <w:color w:val="000000"/>
-                <w:sz w:val="18"/>
-              </w:rPr>
-            </w:r>
-          </w:p>
-        </w:tc>
       </w:tr>
       <w:tr>
         <w:tc>
           <w:tcPr>
-            <w:tcW w:type="dxa" w:w="2880"/>
+            <w:tcW w:type="dxa" w:w="4320"/>
           </w:tcPr>
           <w:p>
             <w:r>
@@ -5988,7 +4146,7 @@
         </w:tc>
         <w:tc>
           <w:tcPr>
-            <w:tcW w:type="dxa" w:w="2880"/>
+            <w:tcW w:type="dxa" w:w="4320"/>
           </w:tcPr>
           <w:p>
             <w:r>
@@ -6003,27 +4161,11 @@
             </w:r>
           </w:p>
         </w:tc>
-        <w:tc>
-          <w:tcPr>
-            <w:tcW w:type="dxa" w:w="2880"/>
-          </w:tcPr>
-          <w:p>
-            <w:r>
-              <w:rPr>
-                <w:rFonts w:ascii="Arial" w:hAnsi="Arial"/>
-                <w:b w:val="0"/>
-                <w:i w:val="0"/>
-                <w:color w:val="000000"/>
-                <w:sz w:val="18"/>
-              </w:rPr>
-            </w:r>
-          </w:p>
-        </w:tc>
       </w:tr>
       <w:tr>
         <w:tc>
           <w:tcPr>
-            <w:tcW w:type="dxa" w:w="2880"/>
+            <w:tcW w:type="dxa" w:w="4320"/>
           </w:tcPr>
           <w:p>
             <w:r>
@@ -6040,7 +4182,7 @@
         </w:tc>
         <w:tc>
           <w:tcPr>
-            <w:tcW w:type="dxa" w:w="2880"/>
+            <w:tcW w:type="dxa" w:w="4320"/>
           </w:tcPr>
           <w:p>
             <w:r>
@@ -6055,27 +4197,11 @@
             </w:r>
           </w:p>
         </w:tc>
-        <w:tc>
-          <w:tcPr>
-            <w:tcW w:type="dxa" w:w="2880"/>
-          </w:tcPr>
-          <w:p>
-            <w:r>
-              <w:rPr>
-                <w:rFonts w:ascii="Arial" w:hAnsi="Arial"/>
-                <w:b w:val="0"/>
-                <w:i w:val="0"/>
-                <w:color w:val="000000"/>
-                <w:sz w:val="18"/>
-              </w:rPr>
-            </w:r>
-          </w:p>
-        </w:tc>
       </w:tr>
       <w:tr>
         <w:tc>
           <w:tcPr>
-            <w:tcW w:type="dxa" w:w="2880"/>
+            <w:tcW w:type="dxa" w:w="4320"/>
           </w:tcPr>
           <w:p>
             <w:r>
@@ -6092,7 +4218,7 @@
         </w:tc>
         <w:tc>
           <w:tcPr>
-            <w:tcW w:type="dxa" w:w="2880"/>
+            <w:tcW w:type="dxa" w:w="4320"/>
           </w:tcPr>
           <w:p>
             <w:r>
@@ -6107,27 +4233,11 @@
             </w:r>
           </w:p>
         </w:tc>
-        <w:tc>
-          <w:tcPr>
-            <w:tcW w:type="dxa" w:w="2880"/>
-          </w:tcPr>
-          <w:p>
-            <w:r>
-              <w:rPr>
-                <w:rFonts w:ascii="Arial" w:hAnsi="Arial"/>
-                <w:b w:val="0"/>
-                <w:i w:val="0"/>
-                <w:color w:val="000000"/>
-                <w:sz w:val="18"/>
-              </w:rPr>
-            </w:r>
-          </w:p>
-        </w:tc>
       </w:tr>
       <w:tr>
         <w:tc>
           <w:tcPr>
-            <w:tcW w:type="dxa" w:w="2880"/>
+            <w:tcW w:type="dxa" w:w="4320"/>
           </w:tcPr>
           <w:p>
             <w:r>
@@ -6144,7 +4254,7 @@
         </w:tc>
         <w:tc>
           <w:tcPr>
-            <w:tcW w:type="dxa" w:w="2880"/>
+            <w:tcW w:type="dxa" w:w="4320"/>
           </w:tcPr>
           <w:p>
             <w:r>
@@ -6159,27 +4269,11 @@
             </w:r>
           </w:p>
         </w:tc>
-        <w:tc>
-          <w:tcPr>
-            <w:tcW w:type="dxa" w:w="2880"/>
-          </w:tcPr>
-          <w:p>
-            <w:r>
-              <w:rPr>
-                <w:rFonts w:ascii="Arial" w:hAnsi="Arial"/>
-                <w:b w:val="0"/>
-                <w:i w:val="0"/>
-                <w:color w:val="000000"/>
-                <w:sz w:val="18"/>
-              </w:rPr>
-            </w:r>
-          </w:p>
-        </w:tc>
       </w:tr>
       <w:tr>
         <w:tc>
           <w:tcPr>
-            <w:tcW w:type="dxa" w:w="2880"/>
+            <w:tcW w:type="dxa" w:w="4320"/>
           </w:tcPr>
           <w:p>
             <w:r>
@@ -6196,7 +4290,7 @@
         </w:tc>
         <w:tc>
           <w:tcPr>
-            <w:tcW w:type="dxa" w:w="2880"/>
+            <w:tcW w:type="dxa" w:w="4320"/>
           </w:tcPr>
           <w:p>
             <w:r>
@@ -6211,27 +4305,11 @@
             </w:r>
           </w:p>
         </w:tc>
-        <w:tc>
-          <w:tcPr>
-            <w:tcW w:type="dxa" w:w="2880"/>
-          </w:tcPr>
-          <w:p>
-            <w:r>
-              <w:rPr>
-                <w:rFonts w:ascii="Arial" w:hAnsi="Arial"/>
-                <w:b w:val="0"/>
-                <w:i w:val="0"/>
-                <w:color w:val="000000"/>
-                <w:sz w:val="18"/>
-              </w:rPr>
-            </w:r>
-          </w:p>
-        </w:tc>
       </w:tr>
       <w:tr>
         <w:tc>
           <w:tcPr>
-            <w:tcW w:type="dxa" w:w="2880"/>
+            <w:tcW w:type="dxa" w:w="4320"/>
           </w:tcPr>
           <w:p>
             <w:r>
@@ -6248,7 +4326,7 @@
         </w:tc>
         <w:tc>
           <w:tcPr>
-            <w:tcW w:type="dxa" w:w="2880"/>
+            <w:tcW w:type="dxa" w:w="4320"/>
           </w:tcPr>
           <w:p>
             <w:r>
@@ -6263,27 +4341,11 @@
             </w:r>
           </w:p>
         </w:tc>
-        <w:tc>
-          <w:tcPr>
-            <w:tcW w:type="dxa" w:w="2880"/>
-          </w:tcPr>
-          <w:p>
-            <w:r>
-              <w:rPr>
-                <w:rFonts w:ascii="Arial" w:hAnsi="Arial"/>
-                <w:b w:val="0"/>
-                <w:i w:val="0"/>
-                <w:color w:val="000000"/>
-                <w:sz w:val="18"/>
-              </w:rPr>
-            </w:r>
-          </w:p>
-        </w:tc>
       </w:tr>
       <w:tr>
         <w:tc>
           <w:tcPr>
-            <w:tcW w:type="dxa" w:w="2880"/>
+            <w:tcW w:type="dxa" w:w="4320"/>
           </w:tcPr>
           <w:p>
             <w:r>
@@ -6300,7 +4362,7 @@
         </w:tc>
         <w:tc>
           <w:tcPr>
-            <w:tcW w:type="dxa" w:w="2880"/>
+            <w:tcW w:type="dxa" w:w="4320"/>
           </w:tcPr>
           <w:p>
             <w:r>
@@ -6315,27 +4377,11 @@
             </w:r>
           </w:p>
         </w:tc>
-        <w:tc>
-          <w:tcPr>
-            <w:tcW w:type="dxa" w:w="2880"/>
-          </w:tcPr>
-          <w:p>
-            <w:r>
-              <w:rPr>
-                <w:rFonts w:ascii="Arial" w:hAnsi="Arial"/>
-                <w:b w:val="0"/>
-                <w:i w:val="0"/>
-                <w:color w:val="000000"/>
-                <w:sz w:val="18"/>
-              </w:rPr>
-            </w:r>
-          </w:p>
-        </w:tc>
       </w:tr>
       <w:tr>
         <w:tc>
           <w:tcPr>
-            <w:tcW w:type="dxa" w:w="2880"/>
+            <w:tcW w:type="dxa" w:w="4320"/>
           </w:tcPr>
           <w:p>
             <w:r>
@@ -6352,7 +4398,7 @@
         </w:tc>
         <w:tc>
           <w:tcPr>
-            <w:tcW w:type="dxa" w:w="2880"/>
+            <w:tcW w:type="dxa" w:w="4320"/>
           </w:tcPr>
           <w:p>
             <w:r>
@@ -6367,27 +4413,11 @@
             </w:r>
           </w:p>
         </w:tc>
-        <w:tc>
-          <w:tcPr>
-            <w:tcW w:type="dxa" w:w="2880"/>
-          </w:tcPr>
-          <w:p>
-            <w:r>
-              <w:rPr>
-                <w:rFonts w:ascii="Arial" w:hAnsi="Arial"/>
-                <w:b w:val="0"/>
-                <w:i w:val="0"/>
-                <w:color w:val="000000"/>
-                <w:sz w:val="18"/>
-              </w:rPr>
-            </w:r>
-          </w:p>
-        </w:tc>
       </w:tr>
       <w:tr>
         <w:tc>
           <w:tcPr>
-            <w:tcW w:type="dxa" w:w="2880"/>
+            <w:tcW w:type="dxa" w:w="4320"/>
           </w:tcPr>
           <w:p>
             <w:r>
@@ -6404,7 +4434,7 @@
         </w:tc>
         <w:tc>
           <w:tcPr>
-            <w:tcW w:type="dxa" w:w="2880"/>
+            <w:tcW w:type="dxa" w:w="4320"/>
           </w:tcPr>
           <w:p>
             <w:r>
@@ -6419,27 +4449,11 @@
             </w:r>
           </w:p>
         </w:tc>
-        <w:tc>
-          <w:tcPr>
-            <w:tcW w:type="dxa" w:w="2880"/>
-          </w:tcPr>
-          <w:p>
-            <w:r>
-              <w:rPr>
-                <w:rFonts w:ascii="Arial" w:hAnsi="Arial"/>
-                <w:b w:val="0"/>
-                <w:i w:val="0"/>
-                <w:color w:val="000000"/>
-                <w:sz w:val="18"/>
-              </w:rPr>
-            </w:r>
-          </w:p>
-        </w:tc>
       </w:tr>
       <w:tr>
         <w:tc>
           <w:tcPr>
-            <w:tcW w:type="dxa" w:w="2880"/>
+            <w:tcW w:type="dxa" w:w="4320"/>
           </w:tcPr>
           <w:p>
             <w:r>
@@ -6456,7 +4470,7 @@
         </w:tc>
         <w:tc>
           <w:tcPr>
-            <w:tcW w:type="dxa" w:w="2880"/>
+            <w:tcW w:type="dxa" w:w="4320"/>
           </w:tcPr>
           <w:p>
             <w:r>
@@ -6471,27 +4485,11 @@
             </w:r>
           </w:p>
         </w:tc>
-        <w:tc>
-          <w:tcPr>
-            <w:tcW w:type="dxa" w:w="2880"/>
-          </w:tcPr>
-          <w:p>
-            <w:r>
-              <w:rPr>
-                <w:rFonts w:ascii="Arial" w:hAnsi="Arial"/>
-                <w:b w:val="0"/>
-                <w:i w:val="0"/>
-                <w:color w:val="000000"/>
-                <w:sz w:val="18"/>
-              </w:rPr>
-            </w:r>
-          </w:p>
-        </w:tc>
       </w:tr>
       <w:tr>
         <w:tc>
           <w:tcPr>
-            <w:tcW w:type="dxa" w:w="2880"/>
+            <w:tcW w:type="dxa" w:w="4320"/>
           </w:tcPr>
           <w:p>
             <w:r>
@@ -6508,7 +4506,7 @@
         </w:tc>
         <w:tc>
           <w:tcPr>
-            <w:tcW w:type="dxa" w:w="2880"/>
+            <w:tcW w:type="dxa" w:w="4320"/>
           </w:tcPr>
           <w:p>
             <w:r>
@@ -6523,27 +4521,11 @@
             </w:r>
           </w:p>
         </w:tc>
-        <w:tc>
-          <w:tcPr>
-            <w:tcW w:type="dxa" w:w="2880"/>
-          </w:tcPr>
-          <w:p>
-            <w:r>
-              <w:rPr>
-                <w:rFonts w:ascii="Arial" w:hAnsi="Arial"/>
-                <w:b w:val="0"/>
-                <w:i w:val="0"/>
-                <w:color w:val="000000"/>
-                <w:sz w:val="18"/>
-              </w:rPr>
-            </w:r>
-          </w:p>
-        </w:tc>
       </w:tr>
       <w:tr>
         <w:tc>
           <w:tcPr>
-            <w:tcW w:type="dxa" w:w="2880"/>
+            <w:tcW w:type="dxa" w:w="4320"/>
           </w:tcPr>
           <w:p>
             <w:r>
@@ -6560,7 +4542,7 @@
         </w:tc>
         <w:tc>
           <w:tcPr>
-            <w:tcW w:type="dxa" w:w="2880"/>
+            <w:tcW w:type="dxa" w:w="4320"/>
           </w:tcPr>
           <w:p>
             <w:r>
@@ -6575,27 +4557,11 @@
             </w:r>
           </w:p>
         </w:tc>
-        <w:tc>
-          <w:tcPr>
-            <w:tcW w:type="dxa" w:w="2880"/>
-          </w:tcPr>
-          <w:p>
-            <w:r>
-              <w:rPr>
-                <w:rFonts w:ascii="Arial" w:hAnsi="Arial"/>
-                <w:b w:val="0"/>
-                <w:i w:val="0"/>
-                <w:color w:val="000000"/>
-                <w:sz w:val="18"/>
-              </w:rPr>
-            </w:r>
-          </w:p>
-        </w:tc>
       </w:tr>
       <w:tr>
         <w:tc>
           <w:tcPr>
-            <w:tcW w:type="dxa" w:w="2880"/>
+            <w:tcW w:type="dxa" w:w="4320"/>
           </w:tcPr>
           <w:p>
             <w:r>
@@ -6612,7 +4578,7 @@
         </w:tc>
         <w:tc>
           <w:tcPr>
-            <w:tcW w:type="dxa" w:w="2880"/>
+            <w:tcW w:type="dxa" w:w="4320"/>
           </w:tcPr>
           <w:p>
             <w:r>
@@ -6624,22 +4590,6 @@
                 <w:sz w:val="18"/>
               </w:rPr>
               <w:t>Activiteiten die geen schermen of elektronische apparaten omvatten. Ze kunnen variëren van hobby's en lichaamsbeweging tot sociale activiteiten die geen digitale invoer vereisen. In DigComp 3.0 verwijzen unplugged-activiteiten voornamelijk naar onderwijs- en leeractiviteiten die geen digitale invoer vereisen.</w:t>
-            </w:r>
-          </w:p>
-        </w:tc>
-        <w:tc>
-          <w:tcPr>
-            <w:tcW w:type="dxa" w:w="2880"/>
-          </w:tcPr>
-          <w:p>
-            <w:r>
-              <w:rPr>
-                <w:rFonts w:ascii="Arial" w:hAnsi="Arial"/>
-                <w:b w:val="0"/>
-                <w:i w:val="0"/>
-                <w:color w:val="000000"/>
-                <w:sz w:val="18"/>
-              </w:rPr>
             </w:r>
           </w:p>
         </w:tc>

</xml_diff>